<commit_message>
345 patients for female
</commit_message>
<xml_diff>
--- a/Article (відновлено автоматично).docx
+++ b/Article (відновлено автоматично).docx
@@ -387,23 +387,7 @@
           <w:b/>
           <w:bCs/>
         </w:rPr>
-        <w:t xml:space="preserve">і </w:t>
-      </w:r>
-      <w:proofErr w:type="spellStart"/>
-      <w:r>
-        <w:rPr>
-          <w:b/>
-          <w:bCs/>
-        </w:rPr>
-        <w:t>і</w:t>
-      </w:r>
-      <w:proofErr w:type="spellEnd"/>
-      <w:r>
-        <w:rPr>
-          <w:b/>
-          <w:bCs/>
-        </w:rPr>
-        <w:t xml:space="preserve"> ті самі індивіди можуть мати один і той самий хронологічний вік, проте різний стан підсистем організму (</w:t>
+        <w:t>і і ті самі індивіди можуть мати один і той самий хронологічний вік, проте різний стан підсистем організму (</w:t>
       </w:r>
       <w:proofErr w:type="spellStart"/>
       <w:r>
@@ -18954,6 +18938,3422 @@
         <w:t>.</w:t>
       </w:r>
     </w:p>
+    <w:p>
+      <w:pPr>
+        <w:ind w:left="360"/>
+        <w:rPr>
+          <w:lang w:val="ru-RU"/>
+        </w:rPr>
+      </w:pPr>
+    </w:p>
+    <w:p>
+      <w:pPr>
+        <w:ind w:left="360"/>
+        <w:jc w:val="center"/>
+        <w:rPr>
+          <w:lang w:val="ru-RU"/>
+        </w:rPr>
+      </w:pPr>
+    </w:p>
+    <w:p>
+      <w:pPr>
+        <w:ind w:left="360"/>
+        <w:jc w:val="center"/>
+        <w:rPr>
+          <w:b/>
+          <w:bCs/>
+          <w:lang w:val="ru-RU"/>
+        </w:rPr>
+      </w:pPr>
+      <w:r>
+        <w:rPr>
+          <w:b/>
+          <w:bCs/>
+          <w:lang w:val="ru-RU"/>
+        </w:rPr>
+        <w:t>Изолиния</w:t>
+      </w:r>
+    </w:p>
+    <w:p>
+      <w:pPr>
+        <w:ind w:left="360"/>
+        <w:rPr>
+          <w:lang w:val="ru-RU"/>
+        </w:rPr>
+      </w:pPr>
+      <w:r>
+        <w:rPr>
+          <w:lang w:val="ru-RU"/>
+        </w:rPr>
+        <w:t>М</w:t>
+      </w:r>
+      <w:proofErr w:type="spellStart"/>
+      <w:r>
+        <w:t>ежду</w:t>
+      </w:r>
+      <w:proofErr w:type="spellEnd"/>
+      <w:r>
+        <w:t xml:space="preserve"> </w:t>
+      </w:r>
+      <w:proofErr w:type="spellStart"/>
+      <w:r>
+        <w:t>волной</w:t>
+      </w:r>
+      <w:proofErr w:type="spellEnd"/>
+      <w:r>
+        <w:t xml:space="preserve"> Р и началом </w:t>
+      </w:r>
+      <w:proofErr w:type="spellStart"/>
+      <w:r>
+        <w:t>комплекса</w:t>
+      </w:r>
+      <w:proofErr w:type="spellEnd"/>
+      <w:r>
+        <w:t xml:space="preserve"> QRS</w:t>
+      </w:r>
+      <w:r>
+        <w:rPr>
+          <w:lang w:val="ru-RU"/>
+        </w:rPr>
+        <w:t>.</w:t>
+      </w:r>
+      <w:r>
+        <w:t xml:space="preserve"> </w:t>
+      </w:r>
+      <w:proofErr w:type="spellStart"/>
+      <w:r>
+        <w:t>Изолиния</w:t>
+      </w:r>
+      <w:proofErr w:type="spellEnd"/>
+      <w:r>
+        <w:t xml:space="preserve"> на ЭКГ — </w:t>
+      </w:r>
+      <w:proofErr w:type="spellStart"/>
+      <w:r>
+        <w:t>это</w:t>
+      </w:r>
+      <w:proofErr w:type="spellEnd"/>
+      <w:r>
+        <w:t xml:space="preserve"> </w:t>
+      </w:r>
+      <w:proofErr w:type="spellStart"/>
+      <w:r>
+        <w:t>базовая</w:t>
+      </w:r>
+      <w:proofErr w:type="spellEnd"/>
+      <w:r>
+        <w:t xml:space="preserve"> </w:t>
+      </w:r>
+      <w:proofErr w:type="spellStart"/>
+      <w:r>
+        <w:t>линия</w:t>
+      </w:r>
+      <w:proofErr w:type="spellEnd"/>
+      <w:r>
+        <w:t xml:space="preserve">, </w:t>
+      </w:r>
+      <w:proofErr w:type="spellStart"/>
+      <w:r>
+        <w:t>относительно</w:t>
+      </w:r>
+      <w:proofErr w:type="spellEnd"/>
+      <w:r>
+        <w:t xml:space="preserve"> </w:t>
+      </w:r>
+      <w:proofErr w:type="spellStart"/>
+      <w:r>
+        <w:t>которой</w:t>
+      </w:r>
+      <w:proofErr w:type="spellEnd"/>
+      <w:r>
+        <w:t xml:space="preserve"> </w:t>
+      </w:r>
+      <w:proofErr w:type="spellStart"/>
+      <w:r>
+        <w:t>происходят</w:t>
+      </w:r>
+      <w:proofErr w:type="spellEnd"/>
+      <w:r>
+        <w:t xml:space="preserve"> все </w:t>
+      </w:r>
+      <w:proofErr w:type="spellStart"/>
+      <w:r>
+        <w:t>электрические</w:t>
+      </w:r>
+      <w:proofErr w:type="spellEnd"/>
+      <w:r>
+        <w:t xml:space="preserve"> </w:t>
+      </w:r>
+      <w:proofErr w:type="spellStart"/>
+      <w:r>
+        <w:t>колебания</w:t>
+      </w:r>
+      <w:proofErr w:type="spellEnd"/>
+      <w:r>
+        <w:t xml:space="preserve"> </w:t>
+      </w:r>
+      <w:proofErr w:type="spellStart"/>
+      <w:r>
+        <w:t>сердца</w:t>
+      </w:r>
+      <w:proofErr w:type="spellEnd"/>
+      <w:r>
+        <w:t xml:space="preserve">. </w:t>
+      </w:r>
+      <w:proofErr w:type="spellStart"/>
+      <w:r>
+        <w:t>Она</w:t>
+      </w:r>
+      <w:proofErr w:type="spellEnd"/>
+      <w:r>
+        <w:t xml:space="preserve"> </w:t>
+      </w:r>
+      <w:proofErr w:type="spellStart"/>
+      <w:r>
+        <w:t>представляет</w:t>
+      </w:r>
+      <w:proofErr w:type="spellEnd"/>
+      <w:r>
+        <w:t xml:space="preserve"> </w:t>
+      </w:r>
+      <w:proofErr w:type="spellStart"/>
+      <w:r>
+        <w:t>собой</w:t>
+      </w:r>
+      <w:proofErr w:type="spellEnd"/>
+      <w:r>
+        <w:t xml:space="preserve"> </w:t>
+      </w:r>
+      <w:proofErr w:type="spellStart"/>
+      <w:r>
+        <w:t>состояние</w:t>
+      </w:r>
+      <w:proofErr w:type="spellEnd"/>
+      <w:r>
+        <w:t xml:space="preserve"> </w:t>
+      </w:r>
+      <w:proofErr w:type="spellStart"/>
+      <w:r>
+        <w:t>покоя</w:t>
+      </w:r>
+      <w:proofErr w:type="spellEnd"/>
+      <w:r>
+        <w:t xml:space="preserve"> </w:t>
+      </w:r>
+      <w:proofErr w:type="spellStart"/>
+      <w:r>
+        <w:t>сердца</w:t>
+      </w:r>
+      <w:proofErr w:type="spellEnd"/>
+      <w:r>
+        <w:t xml:space="preserve"> </w:t>
+      </w:r>
+      <w:proofErr w:type="spellStart"/>
+      <w:r>
+        <w:t>между</w:t>
+      </w:r>
+      <w:proofErr w:type="spellEnd"/>
+      <w:r>
+        <w:t xml:space="preserve"> </w:t>
+      </w:r>
+      <w:proofErr w:type="spellStart"/>
+      <w:r>
+        <w:t>сокращениями</w:t>
+      </w:r>
+      <w:proofErr w:type="spellEnd"/>
+      <w:r>
+        <w:t xml:space="preserve">, </w:t>
+      </w:r>
+      <w:proofErr w:type="spellStart"/>
+      <w:r>
+        <w:t>когда</w:t>
+      </w:r>
+      <w:proofErr w:type="spellEnd"/>
+      <w:r>
+        <w:t xml:space="preserve"> нет </w:t>
+      </w:r>
+      <w:proofErr w:type="spellStart"/>
+      <w:r>
+        <w:t>деполяризации</w:t>
+      </w:r>
+      <w:proofErr w:type="spellEnd"/>
+      <w:r>
+        <w:t xml:space="preserve"> </w:t>
+      </w:r>
+      <w:proofErr w:type="spellStart"/>
+      <w:r>
+        <w:t>или</w:t>
+      </w:r>
+      <w:proofErr w:type="spellEnd"/>
+      <w:r>
+        <w:t xml:space="preserve"> </w:t>
+      </w:r>
+      <w:proofErr w:type="spellStart"/>
+      <w:r>
+        <w:t>реполяризации</w:t>
+      </w:r>
+      <w:proofErr w:type="spellEnd"/>
+      <w:r>
+        <w:t>.</w:t>
+      </w:r>
+    </w:p>
+    <w:p>
+      <w:pPr>
+        <w:ind w:left="360"/>
+        <w:rPr>
+          <w:b/>
+          <w:bCs/>
+        </w:rPr>
+      </w:pPr>
+      <w:r>
+        <w:rPr>
+          <w:b/>
+          <w:bCs/>
+        </w:rPr>
+        <w:t xml:space="preserve">3. </w:t>
+      </w:r>
+      <w:proofErr w:type="spellStart"/>
+      <w:r>
+        <w:rPr>
+          <w:b/>
+          <w:bCs/>
+        </w:rPr>
+        <w:t>Проверь</w:t>
+      </w:r>
+      <w:proofErr w:type="spellEnd"/>
+      <w:r>
+        <w:rPr>
+          <w:b/>
+          <w:bCs/>
+        </w:rPr>
+        <w:t xml:space="preserve"> сегмент PQ (</w:t>
+      </w:r>
+      <w:proofErr w:type="spellStart"/>
+      <w:r>
+        <w:rPr>
+          <w:b/>
+          <w:bCs/>
+        </w:rPr>
+        <w:t>или</w:t>
+      </w:r>
+      <w:proofErr w:type="spellEnd"/>
+      <w:r>
+        <w:rPr>
+          <w:b/>
+          <w:bCs/>
+        </w:rPr>
+        <w:t xml:space="preserve"> PR)</w:t>
+      </w:r>
+    </w:p>
+    <w:p>
+      <w:pPr>
+        <w:ind w:left="360"/>
+        <w:rPr>
+          <w:lang w:val="ru-RU"/>
+        </w:rPr>
+      </w:pPr>
+      <w:r>
+        <w:t>Сегмент PQ (</w:t>
+      </w:r>
+      <w:proofErr w:type="spellStart"/>
+      <w:r>
+        <w:t>или</w:t>
+      </w:r>
+      <w:proofErr w:type="spellEnd"/>
+      <w:r>
+        <w:t xml:space="preserve"> PR) — </w:t>
+      </w:r>
+      <w:proofErr w:type="spellStart"/>
+      <w:r>
+        <w:t>это</w:t>
+      </w:r>
+      <w:proofErr w:type="spellEnd"/>
+      <w:r>
+        <w:t xml:space="preserve"> </w:t>
+      </w:r>
+      <w:proofErr w:type="spellStart"/>
+      <w:r>
+        <w:t>наиболее</w:t>
+      </w:r>
+      <w:proofErr w:type="spellEnd"/>
+      <w:r>
+        <w:t xml:space="preserve"> </w:t>
+      </w:r>
+      <w:proofErr w:type="spellStart"/>
+      <w:r>
+        <w:t>стабильный</w:t>
+      </w:r>
+      <w:proofErr w:type="spellEnd"/>
+      <w:r>
+        <w:t xml:space="preserve"> </w:t>
+      </w:r>
+      <w:proofErr w:type="spellStart"/>
+      <w:r>
+        <w:t>участок</w:t>
+      </w:r>
+      <w:proofErr w:type="spellEnd"/>
+      <w:r>
+        <w:t xml:space="preserve">, </w:t>
+      </w:r>
+      <w:proofErr w:type="spellStart"/>
+      <w:r>
+        <w:t>который</w:t>
+      </w:r>
+      <w:proofErr w:type="spellEnd"/>
+      <w:r>
+        <w:t xml:space="preserve"> часто </w:t>
+      </w:r>
+      <w:proofErr w:type="spellStart"/>
+      <w:r>
+        <w:t>принимается</w:t>
+      </w:r>
+      <w:proofErr w:type="spellEnd"/>
+      <w:r>
+        <w:t xml:space="preserve"> за </w:t>
+      </w:r>
+      <w:proofErr w:type="spellStart"/>
+      <w:r>
+        <w:t>изолинию</w:t>
+      </w:r>
+      <w:proofErr w:type="spellEnd"/>
+      <w:r>
+        <w:t xml:space="preserve">. Он </w:t>
+      </w:r>
+      <w:proofErr w:type="spellStart"/>
+      <w:r>
+        <w:t>идёт</w:t>
+      </w:r>
+      <w:proofErr w:type="spellEnd"/>
+      <w:r>
+        <w:t xml:space="preserve"> </w:t>
+      </w:r>
+      <w:proofErr w:type="spellStart"/>
+      <w:r>
+        <w:t>после</w:t>
+      </w:r>
+      <w:proofErr w:type="spellEnd"/>
+      <w:r>
+        <w:t xml:space="preserve"> </w:t>
+      </w:r>
+      <w:proofErr w:type="spellStart"/>
+      <w:r>
+        <w:t>зубца</w:t>
+      </w:r>
+      <w:proofErr w:type="spellEnd"/>
+      <w:r>
+        <w:t xml:space="preserve"> P и до начала </w:t>
+      </w:r>
+      <w:proofErr w:type="spellStart"/>
+      <w:r>
+        <w:t>комплекса</w:t>
+      </w:r>
+      <w:proofErr w:type="spellEnd"/>
+      <w:r>
+        <w:t xml:space="preserve"> QRS.</w:t>
+      </w:r>
+    </w:p>
+    <w:p>
+      <w:pPr>
+        <w:ind w:left="360"/>
+        <w:rPr>
+          <w:lang w:val="ru-RU"/>
+        </w:rPr>
+      </w:pPr>
+    </w:p>
+    <w:p>
+      <w:pPr>
+        <w:ind w:left="360"/>
+        <w:rPr>
+          <w:b/>
+          <w:bCs/>
+        </w:rPr>
+      </w:pPr>
+      <w:proofErr w:type="spellStart"/>
+      <w:r>
+        <w:rPr>
+          <w:b/>
+          <w:bCs/>
+        </w:rPr>
+        <w:t>Как</w:t>
+      </w:r>
+      <w:proofErr w:type="spellEnd"/>
+      <w:r>
+        <w:rPr>
+          <w:b/>
+          <w:bCs/>
+        </w:rPr>
+        <w:t xml:space="preserve"> </w:t>
+      </w:r>
+      <w:proofErr w:type="spellStart"/>
+      <w:r>
+        <w:rPr>
+          <w:b/>
+          <w:bCs/>
+        </w:rPr>
+        <w:t>определить</w:t>
+      </w:r>
+      <w:proofErr w:type="spellEnd"/>
+      <w:r>
+        <w:rPr>
+          <w:b/>
+          <w:bCs/>
+        </w:rPr>
+        <w:t xml:space="preserve"> </w:t>
+      </w:r>
+      <w:proofErr w:type="spellStart"/>
+      <w:r>
+        <w:rPr>
+          <w:b/>
+          <w:bCs/>
+        </w:rPr>
+        <w:t>изолинию</w:t>
+      </w:r>
+      <w:proofErr w:type="spellEnd"/>
+      <w:r>
+        <w:rPr>
+          <w:b/>
+          <w:bCs/>
+        </w:rPr>
+        <w:t xml:space="preserve"> при </w:t>
+      </w:r>
+      <w:proofErr w:type="spellStart"/>
+      <w:r>
+        <w:rPr>
+          <w:b/>
+          <w:bCs/>
+        </w:rPr>
+        <w:t>искажённой</w:t>
+      </w:r>
+      <w:proofErr w:type="spellEnd"/>
+      <w:r>
+        <w:rPr>
+          <w:b/>
+          <w:bCs/>
+        </w:rPr>
+        <w:t xml:space="preserve"> TP:</w:t>
+      </w:r>
+    </w:p>
+    <w:p>
+      <w:pPr>
+        <w:numPr>
+          <w:ilvl w:val="0"/>
+          <w:numId w:val="10"/>
+        </w:numPr>
+      </w:pPr>
+      <w:proofErr w:type="spellStart"/>
+      <w:r>
+        <w:rPr>
+          <w:b/>
+          <w:bCs/>
+        </w:rPr>
+        <w:t>Смотреть</w:t>
+      </w:r>
+      <w:proofErr w:type="spellEnd"/>
+      <w:r>
+        <w:rPr>
+          <w:b/>
+          <w:bCs/>
+        </w:rPr>
+        <w:t xml:space="preserve"> на сегмент PR (</w:t>
+      </w:r>
+      <w:proofErr w:type="spellStart"/>
+      <w:r>
+        <w:rPr>
+          <w:b/>
+          <w:bCs/>
+        </w:rPr>
+        <w:t>или</w:t>
+      </w:r>
+      <w:proofErr w:type="spellEnd"/>
+      <w:r>
+        <w:rPr>
+          <w:b/>
+          <w:bCs/>
+        </w:rPr>
+        <w:t xml:space="preserve"> PQ)</w:t>
+      </w:r>
+      <w:r>
+        <w:t xml:space="preserve"> — он часто </w:t>
+      </w:r>
+      <w:proofErr w:type="spellStart"/>
+      <w:r>
+        <w:t>более</w:t>
+      </w:r>
+      <w:proofErr w:type="spellEnd"/>
+      <w:r>
+        <w:t xml:space="preserve"> </w:t>
+      </w:r>
+      <w:proofErr w:type="spellStart"/>
+      <w:r>
+        <w:t>устойчив</w:t>
+      </w:r>
+      <w:proofErr w:type="spellEnd"/>
+      <w:r>
+        <w:t xml:space="preserve">, </w:t>
+      </w:r>
+      <w:proofErr w:type="spellStart"/>
+      <w:r>
+        <w:t>особенно</w:t>
+      </w:r>
+      <w:proofErr w:type="spellEnd"/>
+      <w:r>
+        <w:t xml:space="preserve"> у </w:t>
+      </w:r>
+      <w:proofErr w:type="spellStart"/>
+      <w:r>
+        <w:t>медленного</w:t>
+      </w:r>
+      <w:proofErr w:type="spellEnd"/>
+      <w:r>
+        <w:t xml:space="preserve"> </w:t>
+      </w:r>
+      <w:proofErr w:type="spellStart"/>
+      <w:r>
+        <w:t>или</w:t>
+      </w:r>
+      <w:proofErr w:type="spellEnd"/>
+      <w:r>
+        <w:t xml:space="preserve"> нормального </w:t>
+      </w:r>
+      <w:proofErr w:type="spellStart"/>
+      <w:r>
+        <w:t>ритма</w:t>
+      </w:r>
+      <w:proofErr w:type="spellEnd"/>
+      <w:r>
+        <w:t>.</w:t>
+      </w:r>
+    </w:p>
+    <w:p>
+      <w:pPr>
+        <w:ind w:left="360"/>
+        <w:rPr>
+          <w:lang w:val="ru-RU"/>
+        </w:rPr>
+      </w:pPr>
+      <w:proofErr w:type="spellStart"/>
+      <w:r>
+        <w:t>Изолиния</w:t>
+      </w:r>
+      <w:proofErr w:type="spellEnd"/>
+      <w:r>
+        <w:t xml:space="preserve"> — </w:t>
+      </w:r>
+      <w:proofErr w:type="spellStart"/>
+      <w:r>
+        <w:t>это</w:t>
+      </w:r>
+      <w:proofErr w:type="spellEnd"/>
+      <w:r>
+        <w:t xml:space="preserve"> </w:t>
+      </w:r>
+      <w:proofErr w:type="spellStart"/>
+      <w:r>
+        <w:t>идеализированная</w:t>
+      </w:r>
+      <w:proofErr w:type="spellEnd"/>
+      <w:r>
+        <w:t xml:space="preserve"> </w:t>
+      </w:r>
+      <w:proofErr w:type="spellStart"/>
+      <w:r>
+        <w:t>базовая</w:t>
+      </w:r>
+      <w:proofErr w:type="spellEnd"/>
+      <w:r>
+        <w:t xml:space="preserve"> </w:t>
+      </w:r>
+      <w:proofErr w:type="spellStart"/>
+      <w:r>
+        <w:t>линия</w:t>
+      </w:r>
+      <w:proofErr w:type="spellEnd"/>
+      <w:r>
+        <w:t xml:space="preserve">, </w:t>
+      </w:r>
+      <w:proofErr w:type="spellStart"/>
+      <w:r>
+        <w:t>которая</w:t>
+      </w:r>
+      <w:proofErr w:type="spellEnd"/>
+      <w:r>
+        <w:t xml:space="preserve"> </w:t>
+      </w:r>
+      <w:proofErr w:type="spellStart"/>
+      <w:r>
+        <w:t>может</w:t>
+      </w:r>
+      <w:proofErr w:type="spellEnd"/>
+      <w:r>
+        <w:t xml:space="preserve"> не </w:t>
+      </w:r>
+      <w:proofErr w:type="spellStart"/>
+      <w:r>
+        <w:t>совпадать</w:t>
+      </w:r>
+      <w:proofErr w:type="spellEnd"/>
+      <w:r>
+        <w:t xml:space="preserve"> с TP. </w:t>
+      </w:r>
+      <w:proofErr w:type="spellStart"/>
+      <w:r>
+        <w:t>Она</w:t>
+      </w:r>
+      <w:proofErr w:type="spellEnd"/>
+      <w:r>
+        <w:t xml:space="preserve"> </w:t>
+      </w:r>
+      <w:proofErr w:type="spellStart"/>
+      <w:r>
+        <w:t>определяется</w:t>
+      </w:r>
+      <w:proofErr w:type="spellEnd"/>
+      <w:r>
+        <w:t xml:space="preserve"> по максимально плоским, </w:t>
+      </w:r>
+      <w:proofErr w:type="spellStart"/>
+      <w:r>
+        <w:t>спокойным</w:t>
+      </w:r>
+      <w:proofErr w:type="spellEnd"/>
+      <w:r>
+        <w:t xml:space="preserve"> </w:t>
+      </w:r>
+      <w:proofErr w:type="spellStart"/>
+      <w:r>
+        <w:t>участкам</w:t>
+      </w:r>
+      <w:proofErr w:type="spellEnd"/>
+      <w:r>
+        <w:t xml:space="preserve"> ЭКГ, и </w:t>
+      </w:r>
+      <w:proofErr w:type="spellStart"/>
+      <w:r>
+        <w:t>лучше</w:t>
+      </w:r>
+      <w:proofErr w:type="spellEnd"/>
+      <w:r>
+        <w:t xml:space="preserve"> </w:t>
+      </w:r>
+      <w:proofErr w:type="spellStart"/>
+      <w:r>
+        <w:t>всего</w:t>
+      </w:r>
+      <w:proofErr w:type="spellEnd"/>
+      <w:r>
+        <w:t xml:space="preserve"> — по PQ </w:t>
+      </w:r>
+      <w:proofErr w:type="spellStart"/>
+      <w:r>
+        <w:t>или</w:t>
+      </w:r>
+      <w:proofErr w:type="spellEnd"/>
+      <w:r>
+        <w:t xml:space="preserve"> </w:t>
+      </w:r>
+      <w:proofErr w:type="spellStart"/>
+      <w:r>
+        <w:t>между</w:t>
+      </w:r>
+      <w:proofErr w:type="spellEnd"/>
+      <w:r>
+        <w:t xml:space="preserve"> </w:t>
+      </w:r>
+      <w:proofErr w:type="spellStart"/>
+      <w:r>
+        <w:t>окончаниями</w:t>
+      </w:r>
+      <w:proofErr w:type="spellEnd"/>
+      <w:r>
+        <w:t xml:space="preserve"> T и началом P, </w:t>
+      </w:r>
+      <w:proofErr w:type="spellStart"/>
+      <w:r>
+        <w:t>если</w:t>
+      </w:r>
+      <w:proofErr w:type="spellEnd"/>
+      <w:r>
+        <w:t xml:space="preserve"> сигнал </w:t>
+      </w:r>
+      <w:proofErr w:type="spellStart"/>
+      <w:r>
+        <w:t>чист</w:t>
+      </w:r>
+      <w:proofErr w:type="spellEnd"/>
+      <w:r>
+        <w:t>.</w:t>
+      </w:r>
+    </w:p>
+    <w:p>
+      <w:pPr>
+        <w:ind w:left="360"/>
+        <w:rPr>
+          <w:lang w:val="ru-RU"/>
+        </w:rPr>
+      </w:pPr>
+    </w:p>
+    <w:p>
+      <w:pPr>
+        <w:ind w:left="360"/>
+      </w:pPr>
+      <w:proofErr w:type="spellStart"/>
+      <w:r>
+        <w:t>Вот</w:t>
+      </w:r>
+      <w:proofErr w:type="spellEnd"/>
+      <w:r>
+        <w:t xml:space="preserve"> пример </w:t>
+      </w:r>
+      <w:proofErr w:type="spellStart"/>
+      <w:r>
+        <w:t>кода</w:t>
+      </w:r>
+      <w:proofErr w:type="spellEnd"/>
+      <w:r>
+        <w:t xml:space="preserve"> на </w:t>
+      </w:r>
+      <w:proofErr w:type="spellStart"/>
+      <w:r>
+        <w:t>Python</w:t>
+      </w:r>
+      <w:proofErr w:type="spellEnd"/>
+      <w:r>
+        <w:t xml:space="preserve"> с </w:t>
+      </w:r>
+      <w:proofErr w:type="spellStart"/>
+      <w:r>
+        <w:t>использованием</w:t>
+      </w:r>
+      <w:proofErr w:type="spellEnd"/>
+      <w:r>
+        <w:t xml:space="preserve"> </w:t>
+      </w:r>
+      <w:proofErr w:type="spellStart"/>
+      <w:r>
+        <w:t>библиотеки</w:t>
+      </w:r>
+      <w:proofErr w:type="spellEnd"/>
+      <w:r>
+        <w:t xml:space="preserve"> </w:t>
+      </w:r>
+      <w:proofErr w:type="spellStart"/>
+      <w:r>
+        <w:rPr>
+          <w:b/>
+          <w:bCs/>
+        </w:rPr>
+        <w:t>NumPy</w:t>
+      </w:r>
+      <w:proofErr w:type="spellEnd"/>
+      <w:r>
+        <w:t xml:space="preserve"> и </w:t>
+      </w:r>
+      <w:proofErr w:type="spellStart"/>
+      <w:r>
+        <w:rPr>
+          <w:b/>
+          <w:bCs/>
+        </w:rPr>
+        <w:t>SciPy</w:t>
+      </w:r>
+      <w:proofErr w:type="spellEnd"/>
+      <w:r>
+        <w:t xml:space="preserve">, </w:t>
+      </w:r>
+      <w:proofErr w:type="spellStart"/>
+      <w:r>
+        <w:t>который</w:t>
+      </w:r>
+      <w:proofErr w:type="spellEnd"/>
+      <w:r>
+        <w:t xml:space="preserve"> </w:t>
+      </w:r>
+      <w:proofErr w:type="spellStart"/>
+      <w:r>
+        <w:t>находит</w:t>
+      </w:r>
+      <w:proofErr w:type="spellEnd"/>
+      <w:r>
+        <w:t xml:space="preserve"> </w:t>
+      </w:r>
+      <w:proofErr w:type="spellStart"/>
+      <w:r>
+        <w:t>участок</w:t>
+      </w:r>
+      <w:proofErr w:type="spellEnd"/>
+      <w:r>
+        <w:t xml:space="preserve"> </w:t>
+      </w:r>
+      <w:proofErr w:type="spellStart"/>
+      <w:r>
+        <w:t>изолинии</w:t>
+      </w:r>
+      <w:proofErr w:type="spellEnd"/>
+      <w:r>
+        <w:t xml:space="preserve"> на ЭКГ </w:t>
+      </w:r>
+      <w:proofErr w:type="spellStart"/>
+      <w:r>
+        <w:t>автоматически</w:t>
+      </w:r>
+      <w:proofErr w:type="spellEnd"/>
+      <w:r>
+        <w:t xml:space="preserve">, </w:t>
+      </w:r>
+      <w:proofErr w:type="spellStart"/>
+      <w:r>
+        <w:t>ориентируясь</w:t>
+      </w:r>
+      <w:proofErr w:type="spellEnd"/>
+      <w:r>
+        <w:t xml:space="preserve"> на </w:t>
+      </w:r>
+      <w:r>
+        <w:rPr>
+          <w:b/>
+          <w:bCs/>
+        </w:rPr>
+        <w:t>PQ-сегмент</w:t>
+      </w:r>
+      <w:r>
+        <w:t>:</w:t>
+      </w:r>
+    </w:p>
+    <w:p>
+      <w:pPr>
+        <w:ind w:left="360"/>
+      </w:pPr>
+      <w:r>
+        <w:pict w14:anchorId="7E1759E5">
+          <v:rect id="_x0000_i1038" style="width:0;height:1.5pt" o:hralign="center" o:hrstd="t" o:hr="t" fillcolor="#a0a0a0" stroked="f"/>
+        </w:pict>
+      </w:r>
+    </w:p>
+    <w:p>
+      <w:pPr>
+        <w:ind w:left="360"/>
+        <w:rPr>
+          <w:b/>
+          <w:bCs/>
+        </w:rPr>
+      </w:pPr>
+      <w:r>
+        <w:rPr>
+          <w:rFonts w:ascii="Segoe UI Emoji" w:hAnsi="Segoe UI Emoji" w:cs="Segoe UI Emoji"/>
+          <w:b/>
+          <w:bCs/>
+        </w:rPr>
+        <w:t>🧠</w:t>
+      </w:r>
+      <w:r>
+        <w:rPr>
+          <w:b/>
+          <w:bCs/>
+        </w:rPr>
+        <w:t xml:space="preserve"> </w:t>
+      </w:r>
+      <w:proofErr w:type="spellStart"/>
+      <w:r>
+        <w:rPr>
+          <w:b/>
+          <w:bCs/>
+        </w:rPr>
+        <w:t>Идея</w:t>
+      </w:r>
+      <w:proofErr w:type="spellEnd"/>
+      <w:r>
+        <w:rPr>
+          <w:b/>
+          <w:bCs/>
+        </w:rPr>
+        <w:t>:</w:t>
+      </w:r>
+    </w:p>
+    <w:p>
+      <w:pPr>
+        <w:numPr>
+          <w:ilvl w:val="0"/>
+          <w:numId w:val="11"/>
+        </w:numPr>
+      </w:pPr>
+      <w:r>
+        <w:t xml:space="preserve">Найти все </w:t>
+      </w:r>
+      <w:r>
+        <w:rPr>
+          <w:b/>
+          <w:bCs/>
+        </w:rPr>
+        <w:t>P-</w:t>
+      </w:r>
+      <w:proofErr w:type="spellStart"/>
+      <w:r>
+        <w:rPr>
+          <w:b/>
+          <w:bCs/>
+        </w:rPr>
+        <w:t>концы</w:t>
+      </w:r>
+      <w:proofErr w:type="spellEnd"/>
+      <w:r>
+        <w:t xml:space="preserve"> и </w:t>
+      </w:r>
+      <w:r>
+        <w:rPr>
+          <w:b/>
+          <w:bCs/>
+        </w:rPr>
+        <w:t>Q-начала</w:t>
+      </w:r>
+      <w:r>
+        <w:t xml:space="preserve"> (у </w:t>
+      </w:r>
+      <w:proofErr w:type="spellStart"/>
+      <w:r>
+        <w:t>тебя</w:t>
+      </w:r>
+      <w:proofErr w:type="spellEnd"/>
+      <w:r>
+        <w:t xml:space="preserve"> </w:t>
+      </w:r>
+      <w:proofErr w:type="spellStart"/>
+      <w:r>
+        <w:t>они</w:t>
+      </w:r>
+      <w:proofErr w:type="spellEnd"/>
+      <w:r>
+        <w:t xml:space="preserve"> уже </w:t>
+      </w:r>
+      <w:proofErr w:type="spellStart"/>
+      <w:r>
+        <w:t>размечены</w:t>
+      </w:r>
+      <w:proofErr w:type="spellEnd"/>
+      <w:r>
+        <w:t>).</w:t>
+      </w:r>
+    </w:p>
+    <w:p>
+      <w:pPr>
+        <w:numPr>
+          <w:ilvl w:val="0"/>
+          <w:numId w:val="11"/>
+        </w:numPr>
+      </w:pPr>
+      <w:r>
+        <w:t xml:space="preserve">В </w:t>
+      </w:r>
+      <w:proofErr w:type="spellStart"/>
+      <w:r>
+        <w:t>каждом</w:t>
+      </w:r>
+      <w:proofErr w:type="spellEnd"/>
+      <w:r>
+        <w:t xml:space="preserve"> </w:t>
+      </w:r>
+      <w:proofErr w:type="spellStart"/>
+      <w:r>
+        <w:t>интервале</w:t>
+      </w:r>
+      <w:proofErr w:type="spellEnd"/>
+      <w:r>
+        <w:t xml:space="preserve"> </w:t>
+      </w:r>
+      <w:proofErr w:type="spellStart"/>
+      <w:r>
+        <w:t>между</w:t>
+      </w:r>
+      <w:proofErr w:type="spellEnd"/>
+      <w:r>
+        <w:t xml:space="preserve"> ними </w:t>
+      </w:r>
+      <w:proofErr w:type="spellStart"/>
+      <w:r>
+        <w:t>взять</w:t>
+      </w:r>
+      <w:proofErr w:type="spellEnd"/>
+      <w:r>
+        <w:t xml:space="preserve"> сигнал.</w:t>
+      </w:r>
+    </w:p>
+    <w:p>
+      <w:pPr>
+        <w:numPr>
+          <w:ilvl w:val="0"/>
+          <w:numId w:val="11"/>
+        </w:numPr>
+      </w:pPr>
+      <w:proofErr w:type="spellStart"/>
+      <w:r>
+        <w:t>Посчитать</w:t>
+      </w:r>
+      <w:proofErr w:type="spellEnd"/>
+      <w:r>
+        <w:t xml:space="preserve"> </w:t>
+      </w:r>
+      <w:proofErr w:type="spellStart"/>
+      <w:r>
+        <w:rPr>
+          <w:b/>
+          <w:bCs/>
+        </w:rPr>
+        <w:t>среднее</w:t>
+      </w:r>
+      <w:proofErr w:type="spellEnd"/>
+      <w:r>
+        <w:rPr>
+          <w:b/>
+          <w:bCs/>
+        </w:rPr>
+        <w:t xml:space="preserve"> </w:t>
+      </w:r>
+      <w:proofErr w:type="spellStart"/>
+      <w:r>
+        <w:rPr>
+          <w:b/>
+          <w:bCs/>
+        </w:rPr>
+        <w:t>значение</w:t>
+      </w:r>
+      <w:proofErr w:type="spellEnd"/>
+      <w:r>
+        <w:rPr>
+          <w:b/>
+          <w:bCs/>
+        </w:rPr>
+        <w:t xml:space="preserve"> </w:t>
+      </w:r>
+      <w:proofErr w:type="spellStart"/>
+      <w:r>
+        <w:rPr>
+          <w:b/>
+          <w:bCs/>
+        </w:rPr>
+        <w:t>амплитуды</w:t>
+      </w:r>
+      <w:proofErr w:type="spellEnd"/>
+      <w:r>
+        <w:t xml:space="preserve"> — </w:t>
+      </w:r>
+      <w:proofErr w:type="spellStart"/>
+      <w:r>
+        <w:t>это</w:t>
+      </w:r>
+      <w:proofErr w:type="spellEnd"/>
+      <w:r>
+        <w:t xml:space="preserve"> и </w:t>
+      </w:r>
+      <w:proofErr w:type="spellStart"/>
+      <w:r>
+        <w:t>будет</w:t>
+      </w:r>
+      <w:proofErr w:type="spellEnd"/>
+      <w:r>
+        <w:t xml:space="preserve"> </w:t>
+      </w:r>
+      <w:proofErr w:type="spellStart"/>
+      <w:r>
+        <w:t>уровень</w:t>
+      </w:r>
+      <w:proofErr w:type="spellEnd"/>
+      <w:r>
+        <w:t xml:space="preserve"> </w:t>
+      </w:r>
+      <w:proofErr w:type="spellStart"/>
+      <w:r>
+        <w:t>изолинии</w:t>
+      </w:r>
+      <w:proofErr w:type="spellEnd"/>
+      <w:r>
+        <w:t>.</w:t>
+      </w:r>
+    </w:p>
+    <w:p>
+      <w:pPr>
+        <w:ind w:left="720"/>
+        <w:rPr>
+          <w:lang w:val="ru-RU"/>
+        </w:rPr>
+      </w:pPr>
+    </w:p>
+    <w:p>
+      <w:pPr>
+        <w:ind w:left="720"/>
+        <w:jc w:val="center"/>
+        <w:rPr>
+          <w:b/>
+          <w:bCs/>
+        </w:rPr>
+      </w:pPr>
+      <w:r>
+        <w:rPr>
+          <w:b/>
+          <w:bCs/>
+          <w:lang w:val="ru-RU"/>
+        </w:rPr>
+        <w:t>П</w:t>
+      </w:r>
+      <w:proofErr w:type="spellStart"/>
+      <w:r>
+        <w:rPr>
+          <w:b/>
+          <w:bCs/>
+        </w:rPr>
+        <w:t>іки</w:t>
+      </w:r>
+      <w:proofErr w:type="spellEnd"/>
+    </w:p>
+    <w:p>
+      <w:pPr>
+        <w:ind w:left="720"/>
+        <w:rPr>
+          <w:lang w:val="ru-RU"/>
+        </w:rPr>
+      </w:pPr>
+      <w:r>
+        <w:t>Піки нормально визначає.</w:t>
+      </w:r>
+    </w:p>
+    <w:p>
+      <w:pPr>
+        <w:ind w:left="720"/>
+      </w:pPr>
+    </w:p>
+    <w:p>
+      <w:pPr>
+        <w:ind w:left="720"/>
+        <w:rPr>
+          <w:lang w:val="ru-RU"/>
+        </w:rPr>
+      </w:pPr>
+      <w:r>
+        <w:t xml:space="preserve">Начало </w:t>
+      </w:r>
+      <w:proofErr w:type="spellStart"/>
+      <w:r>
+        <w:t>зубца</w:t>
+      </w:r>
+      <w:proofErr w:type="spellEnd"/>
+      <w:r>
+        <w:t xml:space="preserve"> P — </w:t>
+      </w:r>
+      <w:proofErr w:type="spellStart"/>
+      <w:r>
+        <w:t>это</w:t>
+      </w:r>
+      <w:proofErr w:type="spellEnd"/>
+      <w:r>
+        <w:t xml:space="preserve"> </w:t>
+      </w:r>
+      <w:proofErr w:type="spellStart"/>
+      <w:r>
+        <w:t>первая</w:t>
+      </w:r>
+      <w:proofErr w:type="spellEnd"/>
+      <w:r>
+        <w:t xml:space="preserve"> точка, </w:t>
+      </w:r>
+      <w:proofErr w:type="spellStart"/>
+      <w:r>
+        <w:t>где</w:t>
+      </w:r>
+      <w:proofErr w:type="spellEnd"/>
+      <w:r>
+        <w:t xml:space="preserve"> сигнал </w:t>
+      </w:r>
+      <w:proofErr w:type="spellStart"/>
+      <w:r>
+        <w:t>уходит</w:t>
+      </w:r>
+      <w:proofErr w:type="spellEnd"/>
+      <w:r>
+        <w:t xml:space="preserve"> от </w:t>
+      </w:r>
+      <w:proofErr w:type="spellStart"/>
+      <w:r>
+        <w:t>изолинии</w:t>
+      </w:r>
+      <w:proofErr w:type="spellEnd"/>
+      <w:r>
+        <w:t xml:space="preserve">, а не от пика и не от </w:t>
+      </w:r>
+      <w:proofErr w:type="spellStart"/>
+      <w:r>
+        <w:t>нижнего</w:t>
+      </w:r>
+      <w:proofErr w:type="spellEnd"/>
+      <w:r>
+        <w:t xml:space="preserve"> </w:t>
+      </w:r>
+      <w:proofErr w:type="spellStart"/>
+      <w:r>
+        <w:t>значения</w:t>
+      </w:r>
+      <w:proofErr w:type="spellEnd"/>
+      <w:r>
+        <w:t>.</w:t>
+      </w:r>
+    </w:p>
+    <w:p>
+      <w:pPr>
+        <w:ind w:left="360"/>
+      </w:pPr>
+      <w:r>
+        <w:lastRenderedPageBreak/>
+        <w:t xml:space="preserve">То </w:t>
+      </w:r>
+      <w:proofErr w:type="spellStart"/>
+      <w:r>
+        <w:t>есть</w:t>
+      </w:r>
+      <w:proofErr w:type="spellEnd"/>
+      <w:r>
+        <w:t xml:space="preserve"> </w:t>
+      </w:r>
+      <w:proofErr w:type="spellStart"/>
+      <w:r>
+        <w:t>нужно</w:t>
+      </w:r>
+      <w:proofErr w:type="spellEnd"/>
+      <w:r>
+        <w:t xml:space="preserve"> </w:t>
+      </w:r>
+      <w:proofErr w:type="spellStart"/>
+      <w:r>
+        <w:t>отсчитывать</w:t>
+      </w:r>
+      <w:proofErr w:type="spellEnd"/>
+      <w:r>
+        <w:t xml:space="preserve"> P сегмент от начала </w:t>
+      </w:r>
+      <w:proofErr w:type="spellStart"/>
+      <w:r>
+        <w:t>выпуклости</w:t>
+      </w:r>
+      <w:proofErr w:type="spellEnd"/>
+      <w:r>
+        <w:t xml:space="preserve"> вниз от </w:t>
+      </w:r>
+      <w:proofErr w:type="spellStart"/>
+      <w:r>
+        <w:t>изолинии</w:t>
+      </w:r>
+      <w:proofErr w:type="spellEnd"/>
+      <w:r>
+        <w:t>?</w:t>
+      </w:r>
+    </w:p>
+    <w:p>
+      <w:pPr>
+        <w:ind w:left="360"/>
+        <w:rPr>
+          <w:b/>
+          <w:bCs/>
+        </w:rPr>
+      </w:pPr>
+      <w:r>
+        <w:rPr>
+          <w:b/>
+          <w:bCs/>
+        </w:rPr>
+        <w:t xml:space="preserve">Програма </w:t>
+      </w:r>
+      <w:proofErr w:type="spellStart"/>
+      <w:r>
+        <w:rPr>
+          <w:b/>
+          <w:bCs/>
+        </w:rPr>
+        <w:t>ChatGPT</w:t>
+      </w:r>
+      <w:proofErr w:type="spellEnd"/>
+      <w:r>
+        <w:rPr>
+          <w:b/>
+          <w:bCs/>
+        </w:rPr>
+        <w:t xml:space="preserve"> сказала:</w:t>
+      </w:r>
+    </w:p>
+    <w:p>
+      <w:pPr>
+        <w:ind w:left="360"/>
+      </w:pPr>
+      <w:r>
+        <w:t xml:space="preserve">Да, </w:t>
+      </w:r>
+      <w:proofErr w:type="spellStart"/>
+      <w:r>
+        <w:t>именно</w:t>
+      </w:r>
+      <w:proofErr w:type="spellEnd"/>
+      <w:r>
+        <w:t xml:space="preserve"> так — </w:t>
+      </w:r>
+      <w:proofErr w:type="spellStart"/>
+      <w:r>
+        <w:t>ты</w:t>
+      </w:r>
+      <w:proofErr w:type="spellEnd"/>
+      <w:r>
+        <w:t xml:space="preserve"> </w:t>
+      </w:r>
+      <w:proofErr w:type="spellStart"/>
+      <w:r>
+        <w:t>схватываешь</w:t>
+      </w:r>
+      <w:proofErr w:type="spellEnd"/>
+      <w:r>
+        <w:t xml:space="preserve"> суть </w:t>
+      </w:r>
+      <w:proofErr w:type="spellStart"/>
+      <w:r>
+        <w:t>очень</w:t>
+      </w:r>
+      <w:proofErr w:type="spellEnd"/>
+      <w:r>
+        <w:t xml:space="preserve"> точно.</w:t>
+      </w:r>
+    </w:p>
+    <w:p>
+      <w:pPr>
+        <w:ind w:left="360"/>
+      </w:pPr>
+      <w:r>
+        <w:pict w14:anchorId="3FE66185">
+          <v:rect id="_x0000_i1076" style="width:0;height:1.5pt" o:hralign="center" o:hrstd="t" o:hr="t" fillcolor="#a0a0a0" stroked="f"/>
+        </w:pict>
+      </w:r>
+    </w:p>
+    <w:p>
+      <w:pPr>
+        <w:ind w:left="360"/>
+        <w:rPr>
+          <w:b/>
+          <w:bCs/>
+        </w:rPr>
+      </w:pPr>
+      <w:r>
+        <w:rPr>
+          <w:rFonts w:ascii="Segoe UI Emoji" w:hAnsi="Segoe UI Emoji" w:cs="Segoe UI Emoji"/>
+          <w:b/>
+          <w:bCs/>
+        </w:rPr>
+        <w:t>✅</w:t>
+      </w:r>
+      <w:r>
+        <w:rPr>
+          <w:b/>
+          <w:bCs/>
+        </w:rPr>
+        <w:t xml:space="preserve"> </w:t>
+      </w:r>
+      <w:proofErr w:type="spellStart"/>
+      <w:r>
+        <w:rPr>
+          <w:b/>
+          <w:bCs/>
+        </w:rPr>
+        <w:t>Краткий</w:t>
+      </w:r>
+      <w:proofErr w:type="spellEnd"/>
+      <w:r>
+        <w:rPr>
+          <w:b/>
+          <w:bCs/>
+        </w:rPr>
+        <w:t xml:space="preserve"> и </w:t>
+      </w:r>
+      <w:proofErr w:type="spellStart"/>
+      <w:r>
+        <w:rPr>
+          <w:b/>
+          <w:bCs/>
+        </w:rPr>
+        <w:t>точный</w:t>
+      </w:r>
+      <w:proofErr w:type="spellEnd"/>
+      <w:r>
+        <w:rPr>
+          <w:b/>
+          <w:bCs/>
+        </w:rPr>
+        <w:t xml:space="preserve"> </w:t>
+      </w:r>
+      <w:proofErr w:type="spellStart"/>
+      <w:r>
+        <w:rPr>
+          <w:b/>
+          <w:bCs/>
+        </w:rPr>
+        <w:t>ответ</w:t>
+      </w:r>
+      <w:proofErr w:type="spellEnd"/>
+      <w:r>
+        <w:rPr>
+          <w:b/>
+          <w:bCs/>
+        </w:rPr>
+        <w:t>:</w:t>
+      </w:r>
+    </w:p>
+    <w:p>
+      <w:pPr>
+        <w:ind w:left="360"/>
+      </w:pPr>
+      <w:r>
+        <w:rPr>
+          <w:b/>
+          <w:bCs/>
+        </w:rPr>
+        <w:t xml:space="preserve">Да, </w:t>
+      </w:r>
+      <w:proofErr w:type="spellStart"/>
+      <w:r>
+        <w:rPr>
+          <w:b/>
+          <w:bCs/>
+        </w:rPr>
+        <w:t>зубец</w:t>
+      </w:r>
+      <w:proofErr w:type="spellEnd"/>
+      <w:r>
+        <w:rPr>
+          <w:b/>
+          <w:bCs/>
+        </w:rPr>
+        <w:t xml:space="preserve"> P </w:t>
+      </w:r>
+      <w:proofErr w:type="spellStart"/>
+      <w:r>
+        <w:rPr>
+          <w:b/>
+          <w:bCs/>
+        </w:rPr>
+        <w:t>начинается</w:t>
+      </w:r>
+      <w:proofErr w:type="spellEnd"/>
+      <w:r>
+        <w:rPr>
+          <w:b/>
+          <w:bCs/>
+        </w:rPr>
+        <w:t xml:space="preserve"> с </w:t>
+      </w:r>
+      <w:proofErr w:type="spellStart"/>
+      <w:r>
+        <w:rPr>
+          <w:b/>
+          <w:bCs/>
+        </w:rPr>
+        <w:t>момента</w:t>
+      </w:r>
+      <w:proofErr w:type="spellEnd"/>
+      <w:r>
+        <w:rPr>
+          <w:b/>
+          <w:bCs/>
+        </w:rPr>
+        <w:t xml:space="preserve">, </w:t>
+      </w:r>
+      <w:proofErr w:type="spellStart"/>
+      <w:r>
+        <w:rPr>
+          <w:b/>
+          <w:bCs/>
+        </w:rPr>
+        <w:t>когда</w:t>
+      </w:r>
+      <w:proofErr w:type="spellEnd"/>
+      <w:r>
+        <w:rPr>
+          <w:b/>
+          <w:bCs/>
+        </w:rPr>
+        <w:t xml:space="preserve"> сигнал </w:t>
+      </w:r>
+      <w:proofErr w:type="spellStart"/>
+      <w:r>
+        <w:rPr>
+          <w:b/>
+          <w:bCs/>
+        </w:rPr>
+        <w:t>начинает</w:t>
+      </w:r>
+      <w:proofErr w:type="spellEnd"/>
+      <w:r>
+        <w:rPr>
+          <w:b/>
+          <w:bCs/>
+        </w:rPr>
+        <w:t xml:space="preserve"> </w:t>
+      </w:r>
+      <w:proofErr w:type="spellStart"/>
+      <w:r>
+        <w:rPr>
+          <w:b/>
+          <w:bCs/>
+        </w:rPr>
+        <w:t>выпуклость</w:t>
+      </w:r>
+      <w:proofErr w:type="spellEnd"/>
+      <w:r>
+        <w:rPr>
+          <w:b/>
+          <w:bCs/>
+        </w:rPr>
+        <w:t xml:space="preserve"> вниз </w:t>
+      </w:r>
+      <w:proofErr w:type="spellStart"/>
+      <w:r>
+        <w:rPr>
+          <w:b/>
+          <w:bCs/>
+        </w:rPr>
+        <w:t>или</w:t>
+      </w:r>
+      <w:proofErr w:type="spellEnd"/>
+      <w:r>
+        <w:rPr>
+          <w:b/>
+          <w:bCs/>
+        </w:rPr>
+        <w:t xml:space="preserve"> вверх от </w:t>
+      </w:r>
+      <w:proofErr w:type="spellStart"/>
+      <w:r>
+        <w:rPr>
+          <w:b/>
+          <w:bCs/>
+        </w:rPr>
+        <w:t>изолинии</w:t>
+      </w:r>
+      <w:proofErr w:type="spellEnd"/>
+      <w:r>
+        <w:rPr>
+          <w:b/>
+          <w:bCs/>
+        </w:rPr>
+        <w:t xml:space="preserve">, то </w:t>
+      </w:r>
+      <w:proofErr w:type="spellStart"/>
+      <w:r>
+        <w:rPr>
+          <w:b/>
+          <w:bCs/>
+        </w:rPr>
+        <w:t>есть</w:t>
+      </w:r>
+      <w:proofErr w:type="spellEnd"/>
+      <w:r>
+        <w:rPr>
+          <w:b/>
+          <w:bCs/>
+        </w:rPr>
+        <w:t xml:space="preserve"> — от </w:t>
+      </w:r>
+      <w:proofErr w:type="spellStart"/>
+      <w:r>
+        <w:rPr>
+          <w:b/>
+          <w:bCs/>
+        </w:rPr>
+        <w:t>первого</w:t>
+      </w:r>
+      <w:proofErr w:type="spellEnd"/>
+      <w:r>
+        <w:rPr>
+          <w:b/>
+          <w:bCs/>
+        </w:rPr>
+        <w:t xml:space="preserve"> </w:t>
+      </w:r>
+      <w:proofErr w:type="spellStart"/>
+      <w:r>
+        <w:rPr>
+          <w:b/>
+          <w:bCs/>
+        </w:rPr>
+        <w:t>устойчивого</w:t>
+      </w:r>
+      <w:proofErr w:type="spellEnd"/>
+      <w:r>
+        <w:rPr>
+          <w:b/>
+          <w:bCs/>
+        </w:rPr>
+        <w:t xml:space="preserve"> </w:t>
+      </w:r>
+      <w:proofErr w:type="spellStart"/>
+      <w:r>
+        <w:rPr>
+          <w:b/>
+          <w:bCs/>
+        </w:rPr>
+        <w:t>отклонения</w:t>
+      </w:r>
+      <w:proofErr w:type="spellEnd"/>
+      <w:r>
+        <w:rPr>
+          <w:b/>
+          <w:bCs/>
+        </w:rPr>
+        <w:t xml:space="preserve"> от </w:t>
+      </w:r>
+      <w:proofErr w:type="spellStart"/>
+      <w:r>
+        <w:rPr>
+          <w:b/>
+          <w:bCs/>
+        </w:rPr>
+        <w:t>изолинии</w:t>
+      </w:r>
+      <w:proofErr w:type="spellEnd"/>
+      <w:r>
+        <w:rPr>
+          <w:b/>
+          <w:bCs/>
+        </w:rPr>
+        <w:t xml:space="preserve">, </w:t>
+      </w:r>
+      <w:proofErr w:type="spellStart"/>
+      <w:r>
+        <w:rPr>
+          <w:b/>
+          <w:bCs/>
+        </w:rPr>
+        <w:t>даже</w:t>
+      </w:r>
+      <w:proofErr w:type="spellEnd"/>
+      <w:r>
+        <w:rPr>
+          <w:b/>
+          <w:bCs/>
+        </w:rPr>
+        <w:t xml:space="preserve"> </w:t>
+      </w:r>
+      <w:proofErr w:type="spellStart"/>
+      <w:r>
+        <w:rPr>
+          <w:b/>
+          <w:bCs/>
+        </w:rPr>
+        <w:t>если</w:t>
+      </w:r>
+      <w:proofErr w:type="spellEnd"/>
+      <w:r>
+        <w:rPr>
+          <w:b/>
+          <w:bCs/>
+        </w:rPr>
+        <w:t xml:space="preserve"> </w:t>
+      </w:r>
+      <w:proofErr w:type="spellStart"/>
+      <w:r>
+        <w:rPr>
+          <w:b/>
+          <w:bCs/>
+        </w:rPr>
+        <w:t>это</w:t>
+      </w:r>
+      <w:proofErr w:type="spellEnd"/>
+      <w:r>
+        <w:rPr>
+          <w:b/>
+          <w:bCs/>
+        </w:rPr>
+        <w:t xml:space="preserve"> вниз перед </w:t>
+      </w:r>
+      <w:proofErr w:type="spellStart"/>
+      <w:r>
+        <w:rPr>
+          <w:b/>
+          <w:bCs/>
+        </w:rPr>
+        <w:t>основным</w:t>
+      </w:r>
+      <w:proofErr w:type="spellEnd"/>
+      <w:r>
+        <w:rPr>
+          <w:b/>
+          <w:bCs/>
+        </w:rPr>
+        <w:t xml:space="preserve"> </w:t>
+      </w:r>
+      <w:proofErr w:type="spellStart"/>
+      <w:r>
+        <w:rPr>
+          <w:b/>
+          <w:bCs/>
+        </w:rPr>
+        <w:t>подъёмом</w:t>
+      </w:r>
+      <w:proofErr w:type="spellEnd"/>
+      <w:r>
+        <w:rPr>
+          <w:b/>
+          <w:bCs/>
+        </w:rPr>
+        <w:t>.</w:t>
+      </w:r>
+    </w:p>
+    <w:p>
+      <w:pPr>
+        <w:ind w:left="360"/>
+      </w:pPr>
+      <w:r>
+        <w:pict w14:anchorId="0437FDBE">
+          <v:rect id="_x0000_i1077" style="width:0;height:1.5pt" o:hralign="center" o:hrstd="t" o:hr="t" fillcolor="#a0a0a0" stroked="f"/>
+        </w:pict>
+      </w:r>
+    </w:p>
+    <w:p>
+      <w:pPr>
+        <w:ind w:left="360"/>
+        <w:rPr>
+          <w:b/>
+          <w:bCs/>
+        </w:rPr>
+      </w:pPr>
+      <w:r>
+        <w:rPr>
+          <w:rFonts w:ascii="Segoe UI Emoji" w:hAnsi="Segoe UI Emoji" w:cs="Segoe UI Emoji"/>
+          <w:b/>
+          <w:bCs/>
+        </w:rPr>
+        <w:t>🔍</w:t>
+      </w:r>
+      <w:r>
+        <w:rPr>
+          <w:b/>
+          <w:bCs/>
+        </w:rPr>
+        <w:t xml:space="preserve"> </w:t>
+      </w:r>
+      <w:proofErr w:type="spellStart"/>
+      <w:r>
+        <w:rPr>
+          <w:b/>
+          <w:bCs/>
+        </w:rPr>
+        <w:t>Подробное</w:t>
+      </w:r>
+      <w:proofErr w:type="spellEnd"/>
+      <w:r>
+        <w:rPr>
+          <w:b/>
+          <w:bCs/>
+        </w:rPr>
+        <w:t xml:space="preserve"> </w:t>
+      </w:r>
+      <w:proofErr w:type="spellStart"/>
+      <w:r>
+        <w:rPr>
+          <w:b/>
+          <w:bCs/>
+        </w:rPr>
+        <w:t>объяснение</w:t>
+      </w:r>
+      <w:proofErr w:type="spellEnd"/>
+      <w:r>
+        <w:rPr>
+          <w:b/>
+          <w:bCs/>
+        </w:rPr>
+        <w:t>:</w:t>
+      </w:r>
+    </w:p>
+    <w:p>
+      <w:pPr>
+        <w:ind w:left="360"/>
+        <w:rPr>
+          <w:b/>
+          <w:bCs/>
+        </w:rPr>
+      </w:pPr>
+      <w:r>
+        <w:rPr>
+          <w:rFonts w:ascii="Segoe UI Emoji" w:hAnsi="Segoe UI Emoji" w:cs="Segoe UI Emoji"/>
+          <w:b/>
+          <w:bCs/>
+        </w:rPr>
+        <w:t>🔹</w:t>
+      </w:r>
+      <w:r>
+        <w:rPr>
+          <w:b/>
+          <w:bCs/>
+        </w:rPr>
+        <w:t xml:space="preserve"> </w:t>
+      </w:r>
+      <w:proofErr w:type="spellStart"/>
+      <w:r>
+        <w:rPr>
+          <w:b/>
+          <w:bCs/>
+        </w:rPr>
+        <w:t>Зубец</w:t>
+      </w:r>
+      <w:proofErr w:type="spellEnd"/>
+      <w:r>
+        <w:rPr>
+          <w:b/>
+          <w:bCs/>
+        </w:rPr>
+        <w:t xml:space="preserve"> P — </w:t>
+      </w:r>
+      <w:proofErr w:type="spellStart"/>
+      <w:r>
+        <w:rPr>
+          <w:b/>
+          <w:bCs/>
+        </w:rPr>
+        <w:t>это</w:t>
+      </w:r>
+      <w:proofErr w:type="spellEnd"/>
+      <w:r>
+        <w:rPr>
+          <w:b/>
+          <w:bCs/>
+        </w:rPr>
+        <w:t xml:space="preserve"> вся </w:t>
+      </w:r>
+      <w:proofErr w:type="spellStart"/>
+      <w:r>
+        <w:rPr>
+          <w:b/>
+          <w:bCs/>
+        </w:rPr>
+        <w:t>электрическая</w:t>
+      </w:r>
+      <w:proofErr w:type="spellEnd"/>
+      <w:r>
+        <w:rPr>
+          <w:b/>
+          <w:bCs/>
+        </w:rPr>
+        <w:t xml:space="preserve"> </w:t>
+      </w:r>
+      <w:proofErr w:type="spellStart"/>
+      <w:r>
+        <w:rPr>
+          <w:b/>
+          <w:bCs/>
+        </w:rPr>
+        <w:t>активность</w:t>
+      </w:r>
+      <w:proofErr w:type="spellEnd"/>
+      <w:r>
+        <w:rPr>
+          <w:b/>
+          <w:bCs/>
+        </w:rPr>
+        <w:t xml:space="preserve"> </w:t>
+      </w:r>
+      <w:proofErr w:type="spellStart"/>
+      <w:r>
+        <w:rPr>
+          <w:b/>
+          <w:bCs/>
+        </w:rPr>
+        <w:t>предсердий</w:t>
+      </w:r>
+      <w:proofErr w:type="spellEnd"/>
+      <w:r>
+        <w:rPr>
+          <w:b/>
+          <w:bCs/>
+        </w:rPr>
+        <w:t>.</w:t>
+      </w:r>
+    </w:p>
+    <w:p>
+      <w:pPr>
+        <w:numPr>
+          <w:ilvl w:val="0"/>
+          <w:numId w:val="12"/>
+        </w:numPr>
+      </w:pPr>
+      <w:proofErr w:type="spellStart"/>
+      <w:r>
+        <w:t>Она</w:t>
+      </w:r>
+      <w:proofErr w:type="spellEnd"/>
+      <w:r>
+        <w:t xml:space="preserve"> </w:t>
+      </w:r>
+      <w:r>
+        <w:rPr>
+          <w:b/>
+          <w:bCs/>
+        </w:rPr>
+        <w:t xml:space="preserve">не </w:t>
+      </w:r>
+      <w:proofErr w:type="spellStart"/>
+      <w:r>
+        <w:rPr>
+          <w:b/>
+          <w:bCs/>
+        </w:rPr>
+        <w:t>обязательно</w:t>
+      </w:r>
+      <w:proofErr w:type="spellEnd"/>
+      <w:r>
+        <w:rPr>
+          <w:b/>
+          <w:bCs/>
+        </w:rPr>
+        <w:t xml:space="preserve"> </w:t>
+      </w:r>
+      <w:proofErr w:type="spellStart"/>
+      <w:r>
+        <w:rPr>
+          <w:b/>
+          <w:bCs/>
+        </w:rPr>
+        <w:t>начинается</w:t>
+      </w:r>
+      <w:proofErr w:type="spellEnd"/>
+      <w:r>
+        <w:rPr>
+          <w:b/>
+          <w:bCs/>
+        </w:rPr>
+        <w:t xml:space="preserve"> </w:t>
+      </w:r>
+      <w:proofErr w:type="spellStart"/>
+      <w:r>
+        <w:rPr>
+          <w:b/>
+          <w:bCs/>
+        </w:rPr>
+        <w:t>сразу</w:t>
+      </w:r>
+      <w:proofErr w:type="spellEnd"/>
+      <w:r>
+        <w:rPr>
+          <w:b/>
+          <w:bCs/>
+        </w:rPr>
+        <w:t xml:space="preserve"> </w:t>
+      </w:r>
+      <w:proofErr w:type="spellStart"/>
+      <w:r>
+        <w:rPr>
+          <w:b/>
+          <w:bCs/>
+        </w:rPr>
+        <w:t>подъёмом</w:t>
+      </w:r>
+      <w:proofErr w:type="spellEnd"/>
+      <w:r>
+        <w:rPr>
+          <w:b/>
+          <w:bCs/>
+        </w:rPr>
+        <w:t xml:space="preserve"> вверх</w:t>
+      </w:r>
+      <w:r>
+        <w:t>.</w:t>
+      </w:r>
+    </w:p>
+    <w:p>
+      <w:pPr>
+        <w:numPr>
+          <w:ilvl w:val="0"/>
+          <w:numId w:val="12"/>
+        </w:numPr>
+      </w:pPr>
+      <w:proofErr w:type="spellStart"/>
+      <w:r>
+        <w:t>Может</w:t>
+      </w:r>
+      <w:proofErr w:type="spellEnd"/>
+      <w:r>
+        <w:t xml:space="preserve"> </w:t>
+      </w:r>
+      <w:proofErr w:type="spellStart"/>
+      <w:r>
+        <w:t>быть</w:t>
+      </w:r>
+      <w:proofErr w:type="spellEnd"/>
+      <w:r>
+        <w:t xml:space="preserve"> </w:t>
+      </w:r>
+      <w:proofErr w:type="spellStart"/>
+      <w:r>
+        <w:rPr>
+          <w:b/>
+          <w:bCs/>
+        </w:rPr>
+        <w:t>предварительное</w:t>
+      </w:r>
+      <w:proofErr w:type="spellEnd"/>
+      <w:r>
+        <w:rPr>
+          <w:b/>
+          <w:bCs/>
+        </w:rPr>
+        <w:t xml:space="preserve"> </w:t>
+      </w:r>
+      <w:proofErr w:type="spellStart"/>
+      <w:r>
+        <w:rPr>
+          <w:b/>
+          <w:bCs/>
+        </w:rPr>
+        <w:t>отклонение</w:t>
+      </w:r>
+      <w:proofErr w:type="spellEnd"/>
+      <w:r>
+        <w:rPr>
+          <w:b/>
+          <w:bCs/>
+        </w:rPr>
+        <w:t xml:space="preserve"> вниз</w:t>
+      </w:r>
+      <w:r>
+        <w:t xml:space="preserve"> (</w:t>
+      </w:r>
+      <w:proofErr w:type="spellStart"/>
+      <w:r>
+        <w:t>небольшое</w:t>
+      </w:r>
+      <w:proofErr w:type="spellEnd"/>
+      <w:r>
+        <w:t xml:space="preserve"> «</w:t>
+      </w:r>
+      <w:proofErr w:type="spellStart"/>
+      <w:r>
+        <w:t>плечо</w:t>
+      </w:r>
+      <w:proofErr w:type="spellEnd"/>
+      <w:r>
+        <w:t xml:space="preserve">» </w:t>
+      </w:r>
+      <w:proofErr w:type="spellStart"/>
+      <w:r>
+        <w:t>или</w:t>
+      </w:r>
+      <w:proofErr w:type="spellEnd"/>
+      <w:r>
+        <w:t xml:space="preserve"> </w:t>
+      </w:r>
+      <w:proofErr w:type="spellStart"/>
+      <w:r>
+        <w:t>волна</w:t>
+      </w:r>
+      <w:proofErr w:type="spellEnd"/>
+      <w:r>
+        <w:t>).</w:t>
+      </w:r>
+    </w:p>
+    <w:p>
+      <w:pPr>
+        <w:ind w:left="360"/>
+        <w:rPr>
+          <w:b/>
+          <w:bCs/>
+        </w:rPr>
+      </w:pPr>
+      <w:r>
+        <w:rPr>
+          <w:rFonts w:ascii="Segoe UI Emoji" w:hAnsi="Segoe UI Emoji" w:cs="Segoe UI Emoji"/>
+          <w:b/>
+          <w:bCs/>
+        </w:rPr>
+        <w:t>🔹</w:t>
+      </w:r>
+      <w:r>
+        <w:rPr>
+          <w:b/>
+          <w:bCs/>
+        </w:rPr>
+        <w:t xml:space="preserve"> </w:t>
+      </w:r>
+      <w:proofErr w:type="spellStart"/>
+      <w:r>
+        <w:rPr>
+          <w:b/>
+          <w:bCs/>
+        </w:rPr>
+        <w:t>Физиологически</w:t>
+      </w:r>
+      <w:proofErr w:type="spellEnd"/>
+      <w:r>
+        <w:rPr>
+          <w:b/>
+          <w:bCs/>
+        </w:rPr>
+        <w:t xml:space="preserve"> правильно:</w:t>
+      </w:r>
+    </w:p>
+    <w:p>
+      <w:pPr>
+        <w:numPr>
+          <w:ilvl w:val="0"/>
+          <w:numId w:val="13"/>
+        </w:numPr>
+      </w:pPr>
+      <w:r>
+        <w:t xml:space="preserve">Начало P — </w:t>
+      </w:r>
+      <w:proofErr w:type="spellStart"/>
+      <w:r>
+        <w:rPr>
+          <w:b/>
+          <w:bCs/>
+        </w:rPr>
+        <w:t>первая</w:t>
+      </w:r>
+      <w:proofErr w:type="spellEnd"/>
+      <w:r>
+        <w:rPr>
+          <w:b/>
+          <w:bCs/>
+        </w:rPr>
+        <w:t xml:space="preserve"> точка, </w:t>
+      </w:r>
+      <w:proofErr w:type="spellStart"/>
+      <w:r>
+        <w:rPr>
+          <w:b/>
+          <w:bCs/>
+        </w:rPr>
+        <w:t>где</w:t>
+      </w:r>
+      <w:proofErr w:type="spellEnd"/>
+      <w:r>
+        <w:rPr>
+          <w:b/>
+          <w:bCs/>
+        </w:rPr>
+        <w:t xml:space="preserve"> </w:t>
+      </w:r>
+      <w:proofErr w:type="spellStart"/>
+      <w:r>
+        <w:rPr>
+          <w:b/>
+          <w:bCs/>
+        </w:rPr>
+        <w:t>кривая</w:t>
+      </w:r>
+      <w:proofErr w:type="spellEnd"/>
+      <w:r>
+        <w:rPr>
+          <w:b/>
+          <w:bCs/>
+        </w:rPr>
+        <w:t xml:space="preserve"> </w:t>
+      </w:r>
+      <w:proofErr w:type="spellStart"/>
+      <w:r>
+        <w:rPr>
+          <w:b/>
+          <w:bCs/>
+        </w:rPr>
+        <w:t>отрывается</w:t>
+      </w:r>
+      <w:proofErr w:type="spellEnd"/>
+      <w:r>
+        <w:rPr>
+          <w:b/>
+          <w:bCs/>
+        </w:rPr>
+        <w:t xml:space="preserve"> от </w:t>
+      </w:r>
+      <w:proofErr w:type="spellStart"/>
+      <w:r>
+        <w:rPr>
+          <w:b/>
+          <w:bCs/>
+        </w:rPr>
+        <w:t>изолинии</w:t>
+      </w:r>
+      <w:proofErr w:type="spellEnd"/>
+      <w:r>
+        <w:t>;</w:t>
+      </w:r>
+    </w:p>
+    <w:p>
+      <w:pPr>
+        <w:numPr>
+          <w:ilvl w:val="0"/>
+          <w:numId w:val="13"/>
+        </w:numPr>
+      </w:pPr>
+      <w:proofErr w:type="spellStart"/>
+      <w:r>
+        <w:t>Это</w:t>
+      </w:r>
+      <w:proofErr w:type="spellEnd"/>
+      <w:r>
+        <w:t xml:space="preserve"> </w:t>
+      </w:r>
+      <w:proofErr w:type="spellStart"/>
+      <w:r>
+        <w:t>может</w:t>
+      </w:r>
+      <w:proofErr w:type="spellEnd"/>
+      <w:r>
+        <w:t xml:space="preserve"> </w:t>
+      </w:r>
+      <w:proofErr w:type="spellStart"/>
+      <w:r>
+        <w:t>быть</w:t>
+      </w:r>
+      <w:proofErr w:type="spellEnd"/>
+      <w:r>
+        <w:t xml:space="preserve"> </w:t>
+      </w:r>
+      <w:proofErr w:type="spellStart"/>
+      <w:r>
+        <w:t>как</w:t>
+      </w:r>
+      <w:proofErr w:type="spellEnd"/>
+      <w:r>
+        <w:t xml:space="preserve"> </w:t>
+      </w:r>
+      <w:r>
+        <w:rPr>
+          <w:b/>
+          <w:bCs/>
+        </w:rPr>
+        <w:t>вниз</w:t>
+      </w:r>
+      <w:r>
+        <w:t xml:space="preserve">, так и </w:t>
+      </w:r>
+      <w:r>
+        <w:rPr>
+          <w:b/>
+          <w:bCs/>
+        </w:rPr>
+        <w:t>вверх</w:t>
+      </w:r>
+      <w:r>
+        <w:t>;</w:t>
+      </w:r>
+    </w:p>
+    <w:p>
+      <w:pPr>
+        <w:numPr>
+          <w:ilvl w:val="0"/>
+          <w:numId w:val="13"/>
+        </w:numPr>
+      </w:pPr>
+      <w:proofErr w:type="spellStart"/>
+      <w:r>
+        <w:t>Даже</w:t>
+      </w:r>
+      <w:proofErr w:type="spellEnd"/>
+      <w:r>
+        <w:t xml:space="preserve"> </w:t>
+      </w:r>
+      <w:proofErr w:type="spellStart"/>
+      <w:r>
+        <w:t>если</w:t>
+      </w:r>
+      <w:proofErr w:type="spellEnd"/>
+      <w:r>
+        <w:t xml:space="preserve"> сигнал </w:t>
+      </w:r>
+      <w:proofErr w:type="spellStart"/>
+      <w:r>
+        <w:t>уходит</w:t>
+      </w:r>
+      <w:proofErr w:type="spellEnd"/>
+      <w:r>
+        <w:t xml:space="preserve"> </w:t>
+      </w:r>
+      <w:proofErr w:type="spellStart"/>
+      <w:r>
+        <w:t>сначала</w:t>
+      </w:r>
+      <w:proofErr w:type="spellEnd"/>
+      <w:r>
+        <w:t xml:space="preserve"> </w:t>
+      </w:r>
+      <w:proofErr w:type="spellStart"/>
+      <w:r>
+        <w:t>немного</w:t>
+      </w:r>
+      <w:proofErr w:type="spellEnd"/>
+      <w:r>
+        <w:t xml:space="preserve"> вниз, потом вверх — </w:t>
+      </w:r>
+      <w:r>
+        <w:rPr>
+          <w:b/>
+          <w:bCs/>
+        </w:rPr>
+        <w:t xml:space="preserve">вся </w:t>
+      </w:r>
+      <w:proofErr w:type="spellStart"/>
+      <w:r>
+        <w:rPr>
+          <w:b/>
+          <w:bCs/>
+        </w:rPr>
+        <w:t>эта</w:t>
+      </w:r>
+      <w:proofErr w:type="spellEnd"/>
+      <w:r>
+        <w:rPr>
+          <w:b/>
+          <w:bCs/>
+        </w:rPr>
+        <w:t xml:space="preserve"> форма </w:t>
+      </w:r>
+      <w:proofErr w:type="spellStart"/>
+      <w:r>
+        <w:rPr>
+          <w:b/>
+          <w:bCs/>
+        </w:rPr>
+        <w:t>входит</w:t>
+      </w:r>
+      <w:proofErr w:type="spellEnd"/>
+      <w:r>
+        <w:rPr>
+          <w:b/>
+          <w:bCs/>
+        </w:rPr>
+        <w:t xml:space="preserve"> в </w:t>
+      </w:r>
+      <w:proofErr w:type="spellStart"/>
+      <w:r>
+        <w:rPr>
+          <w:b/>
+          <w:bCs/>
+        </w:rPr>
+        <w:t>зубец</w:t>
+      </w:r>
+      <w:proofErr w:type="spellEnd"/>
+      <w:r>
+        <w:rPr>
+          <w:b/>
+          <w:bCs/>
+        </w:rPr>
+        <w:t xml:space="preserve"> P</w:t>
+      </w:r>
+      <w:r>
+        <w:t>.</w:t>
+      </w:r>
+    </w:p>
+    <w:p>
+      <w:pPr>
+        <w:ind w:left="360"/>
+      </w:pPr>
+      <w:r>
+        <w:pict w14:anchorId="730E0E01">
+          <v:rect id="_x0000_i1078" style="width:0;height:1.5pt" o:hralign="center" o:hrstd="t" o:hr="t" fillcolor="#a0a0a0" stroked="f"/>
+        </w:pict>
+      </w:r>
+    </w:p>
+    <w:p>
+      <w:pPr>
+        <w:ind w:left="360"/>
+        <w:rPr>
+          <w:b/>
+          <w:bCs/>
+        </w:rPr>
+      </w:pPr>
+      <w:r>
+        <w:rPr>
+          <w:rFonts w:ascii="Segoe UI Emoji" w:hAnsi="Segoe UI Emoji" w:cs="Segoe UI Emoji"/>
+          <w:b/>
+          <w:bCs/>
+        </w:rPr>
+        <w:t>🔎</w:t>
+      </w:r>
+      <w:r>
+        <w:rPr>
+          <w:b/>
+          <w:bCs/>
+        </w:rPr>
+        <w:t xml:space="preserve"> На </w:t>
+      </w:r>
+      <w:proofErr w:type="spellStart"/>
+      <w:r>
+        <w:rPr>
+          <w:b/>
+          <w:bCs/>
+        </w:rPr>
+        <w:t>твоём</w:t>
+      </w:r>
+      <w:proofErr w:type="spellEnd"/>
+      <w:r>
+        <w:rPr>
+          <w:b/>
+          <w:bCs/>
+        </w:rPr>
+        <w:t xml:space="preserve"> </w:t>
+      </w:r>
+      <w:proofErr w:type="spellStart"/>
+      <w:r>
+        <w:rPr>
+          <w:b/>
+          <w:bCs/>
+        </w:rPr>
+        <w:t>графике</w:t>
+      </w:r>
+      <w:proofErr w:type="spellEnd"/>
+      <w:r>
+        <w:rPr>
+          <w:b/>
+          <w:bCs/>
+        </w:rPr>
+        <w:t>:</w:t>
+      </w:r>
+    </w:p>
+    <w:p>
+      <w:pPr>
+        <w:numPr>
+          <w:ilvl w:val="0"/>
+          <w:numId w:val="14"/>
+        </w:numPr>
+      </w:pPr>
+      <w:r>
+        <w:t xml:space="preserve">Перед </w:t>
+      </w:r>
+      <w:proofErr w:type="spellStart"/>
+      <w:r>
+        <w:t>главным</w:t>
+      </w:r>
+      <w:proofErr w:type="spellEnd"/>
+      <w:r>
+        <w:t xml:space="preserve"> </w:t>
+      </w:r>
+      <w:proofErr w:type="spellStart"/>
+      <w:r>
+        <w:t>подъёмом</w:t>
+      </w:r>
+      <w:proofErr w:type="spellEnd"/>
+      <w:r>
+        <w:t xml:space="preserve"> </w:t>
+      </w:r>
+      <w:proofErr w:type="spellStart"/>
+      <w:r>
+        <w:t>зубца</w:t>
+      </w:r>
+      <w:proofErr w:type="spellEnd"/>
+      <w:r>
+        <w:t xml:space="preserve"> P (пик в ~1470 мс) </w:t>
+      </w:r>
+      <w:proofErr w:type="spellStart"/>
+      <w:r>
+        <w:t>есть</w:t>
+      </w:r>
+      <w:proofErr w:type="spellEnd"/>
+      <w:r>
+        <w:t xml:space="preserve"> </w:t>
+      </w:r>
+      <w:proofErr w:type="spellStart"/>
+      <w:r>
+        <w:rPr>
+          <w:b/>
+          <w:bCs/>
+        </w:rPr>
+        <w:t>плавная</w:t>
+      </w:r>
+      <w:proofErr w:type="spellEnd"/>
+      <w:r>
+        <w:rPr>
+          <w:b/>
+          <w:bCs/>
+        </w:rPr>
+        <w:t xml:space="preserve"> </w:t>
+      </w:r>
+      <w:proofErr w:type="spellStart"/>
+      <w:r>
+        <w:rPr>
+          <w:b/>
+          <w:bCs/>
+        </w:rPr>
+        <w:t>выпуклость</w:t>
+      </w:r>
+      <w:proofErr w:type="spellEnd"/>
+      <w:r>
+        <w:rPr>
+          <w:b/>
+          <w:bCs/>
+        </w:rPr>
+        <w:t xml:space="preserve"> вниз </w:t>
+      </w:r>
+      <w:proofErr w:type="spellStart"/>
+      <w:r>
+        <w:rPr>
+          <w:b/>
+          <w:bCs/>
+        </w:rPr>
+        <w:t>начиная</w:t>
+      </w:r>
+      <w:proofErr w:type="spellEnd"/>
+      <w:r>
+        <w:rPr>
+          <w:b/>
+          <w:bCs/>
+        </w:rPr>
+        <w:t xml:space="preserve"> </w:t>
+      </w:r>
+      <w:proofErr w:type="spellStart"/>
+      <w:r>
+        <w:rPr>
+          <w:b/>
+          <w:bCs/>
+        </w:rPr>
+        <w:t>примерно</w:t>
+      </w:r>
+      <w:proofErr w:type="spellEnd"/>
+      <w:r>
+        <w:rPr>
+          <w:b/>
+          <w:bCs/>
+        </w:rPr>
+        <w:t xml:space="preserve"> с ~1420–1425 мс</w:t>
+      </w:r>
+      <w:r>
+        <w:t>.</w:t>
+      </w:r>
+    </w:p>
+    <w:p>
+      <w:pPr>
+        <w:numPr>
+          <w:ilvl w:val="0"/>
+          <w:numId w:val="14"/>
+        </w:numPr>
+      </w:pPr>
+      <w:proofErr w:type="spellStart"/>
+      <w:r>
+        <w:t>Именно</w:t>
+      </w:r>
+      <w:proofErr w:type="spellEnd"/>
+      <w:r>
+        <w:t xml:space="preserve"> </w:t>
+      </w:r>
+      <w:proofErr w:type="spellStart"/>
+      <w:r>
+        <w:t>эта</w:t>
+      </w:r>
+      <w:proofErr w:type="spellEnd"/>
+      <w:r>
+        <w:t xml:space="preserve"> точка и </w:t>
+      </w:r>
+      <w:proofErr w:type="spellStart"/>
+      <w:r>
+        <w:t>есть</w:t>
+      </w:r>
+      <w:proofErr w:type="spellEnd"/>
+      <w:r>
+        <w:t xml:space="preserve"> </w:t>
+      </w:r>
+      <w:r>
+        <w:rPr>
+          <w:b/>
+          <w:bCs/>
+        </w:rPr>
+        <w:t xml:space="preserve">начало </w:t>
+      </w:r>
+      <w:proofErr w:type="spellStart"/>
+      <w:r>
+        <w:rPr>
+          <w:b/>
+          <w:bCs/>
+        </w:rPr>
+        <w:t>зубца</w:t>
+      </w:r>
+      <w:proofErr w:type="spellEnd"/>
+      <w:r>
+        <w:rPr>
+          <w:b/>
+          <w:bCs/>
+        </w:rPr>
+        <w:t xml:space="preserve"> P</w:t>
+      </w:r>
+      <w:r>
+        <w:t>.</w:t>
+      </w:r>
+    </w:p>
+    <w:p>
+      <w:pPr>
+        <w:ind w:left="360"/>
+      </w:pPr>
+      <w:r>
+        <w:pict w14:anchorId="7D3C2E1A">
+          <v:rect id="_x0000_i1079" style="width:0;height:1.5pt" o:hralign="center" o:hrstd="t" o:hr="t" fillcolor="#a0a0a0" stroked="f"/>
+        </w:pict>
+      </w:r>
+    </w:p>
+    <w:p>
+      <w:pPr>
+        <w:ind w:left="360"/>
+        <w:rPr>
+          <w:b/>
+          <w:bCs/>
+        </w:rPr>
+      </w:pPr>
+      <w:r>
+        <w:rPr>
+          <w:rFonts w:ascii="Segoe UI Emoji" w:hAnsi="Segoe UI Emoji" w:cs="Segoe UI Emoji"/>
+          <w:b/>
+          <w:bCs/>
+        </w:rPr>
+        <w:t>📐</w:t>
+      </w:r>
+      <w:r>
+        <w:rPr>
+          <w:b/>
+          <w:bCs/>
+        </w:rPr>
+        <w:t xml:space="preserve"> </w:t>
+      </w:r>
+      <w:proofErr w:type="spellStart"/>
+      <w:r>
+        <w:rPr>
+          <w:b/>
+          <w:bCs/>
+        </w:rPr>
+        <w:t>Как</w:t>
+      </w:r>
+      <w:proofErr w:type="spellEnd"/>
+      <w:r>
+        <w:rPr>
+          <w:b/>
+          <w:bCs/>
+        </w:rPr>
+        <w:t xml:space="preserve"> </w:t>
+      </w:r>
+      <w:proofErr w:type="spellStart"/>
+      <w:r>
+        <w:rPr>
+          <w:b/>
+          <w:bCs/>
+        </w:rPr>
+        <w:t>распознать</w:t>
+      </w:r>
+      <w:proofErr w:type="spellEnd"/>
+      <w:r>
+        <w:rPr>
+          <w:b/>
+          <w:bCs/>
+        </w:rPr>
+        <w:t xml:space="preserve"> </w:t>
+      </w:r>
+      <w:proofErr w:type="spellStart"/>
+      <w:r>
+        <w:rPr>
+          <w:b/>
+          <w:bCs/>
+        </w:rPr>
+        <w:t>это</w:t>
+      </w:r>
+      <w:proofErr w:type="spellEnd"/>
+      <w:r>
+        <w:rPr>
+          <w:b/>
+          <w:bCs/>
+        </w:rPr>
+        <w:t xml:space="preserve"> </w:t>
+      </w:r>
+      <w:proofErr w:type="spellStart"/>
+      <w:r>
+        <w:rPr>
+          <w:b/>
+          <w:bCs/>
+        </w:rPr>
+        <w:t>программно</w:t>
+      </w:r>
+      <w:proofErr w:type="spellEnd"/>
+      <w:r>
+        <w:rPr>
+          <w:b/>
+          <w:bCs/>
+        </w:rPr>
+        <w:t>:</w:t>
+      </w:r>
+    </w:p>
+    <w:p>
+      <w:pPr>
+        <w:numPr>
+          <w:ilvl w:val="0"/>
+          <w:numId w:val="15"/>
+        </w:numPr>
+      </w:pPr>
+      <w:proofErr w:type="spellStart"/>
+      <w:r>
+        <w:t>Взять</w:t>
+      </w:r>
+      <w:proofErr w:type="spellEnd"/>
+      <w:r>
+        <w:t xml:space="preserve"> </w:t>
+      </w:r>
+      <w:proofErr w:type="spellStart"/>
+      <w:r>
+        <w:t>небольшой</w:t>
+      </w:r>
+      <w:proofErr w:type="spellEnd"/>
+      <w:r>
+        <w:t xml:space="preserve"> </w:t>
+      </w:r>
+      <w:proofErr w:type="spellStart"/>
+      <w:r>
+        <w:t>отрезок</w:t>
+      </w:r>
+      <w:proofErr w:type="spellEnd"/>
+      <w:r>
+        <w:t xml:space="preserve"> до P-пика (100–120 мс).</w:t>
+      </w:r>
+    </w:p>
+    <w:p>
+      <w:pPr>
+        <w:numPr>
+          <w:ilvl w:val="0"/>
+          <w:numId w:val="15"/>
+        </w:numPr>
+      </w:pPr>
+      <w:r>
+        <w:t xml:space="preserve">Найти </w:t>
+      </w:r>
+      <w:proofErr w:type="spellStart"/>
+      <w:r>
+        <w:t>изолинию</w:t>
+      </w:r>
+      <w:proofErr w:type="spellEnd"/>
+      <w:r>
+        <w:t xml:space="preserve"> (</w:t>
+      </w:r>
+      <w:proofErr w:type="spellStart"/>
+      <w:r>
+        <w:t>например</w:t>
+      </w:r>
+      <w:proofErr w:type="spellEnd"/>
+      <w:r>
+        <w:t>, по PQ-сегменту).</w:t>
+      </w:r>
+    </w:p>
+    <w:p>
+      <w:pPr>
+        <w:numPr>
+          <w:ilvl w:val="0"/>
+          <w:numId w:val="15"/>
+        </w:numPr>
+      </w:pPr>
+      <w:r>
+        <w:t>Пройти от пика назад:</w:t>
+      </w:r>
+    </w:p>
+    <w:p>
+      <w:pPr>
+        <w:numPr>
+          <w:ilvl w:val="1"/>
+          <w:numId w:val="15"/>
+        </w:numPr>
+      </w:pPr>
+      <w:r>
+        <w:t xml:space="preserve">найти </w:t>
+      </w:r>
+      <w:r>
+        <w:rPr>
+          <w:b/>
+          <w:bCs/>
+        </w:rPr>
+        <w:t xml:space="preserve">точку, </w:t>
+      </w:r>
+      <w:proofErr w:type="spellStart"/>
+      <w:r>
+        <w:rPr>
+          <w:b/>
+          <w:bCs/>
+        </w:rPr>
+        <w:t>где</w:t>
+      </w:r>
+      <w:proofErr w:type="spellEnd"/>
+      <w:r>
+        <w:rPr>
+          <w:b/>
+          <w:bCs/>
+        </w:rPr>
+        <w:t xml:space="preserve"> сигнал </w:t>
+      </w:r>
+      <w:proofErr w:type="spellStart"/>
+      <w:r>
+        <w:rPr>
+          <w:b/>
+          <w:bCs/>
+        </w:rPr>
+        <w:t>стабильно</w:t>
+      </w:r>
+      <w:proofErr w:type="spellEnd"/>
+      <w:r>
+        <w:rPr>
+          <w:b/>
+          <w:bCs/>
+        </w:rPr>
+        <w:t xml:space="preserve"> </w:t>
+      </w:r>
+      <w:proofErr w:type="spellStart"/>
+      <w:r>
+        <w:rPr>
+          <w:b/>
+          <w:bCs/>
+        </w:rPr>
+        <w:t>уходит</w:t>
+      </w:r>
+      <w:proofErr w:type="spellEnd"/>
+      <w:r>
+        <w:rPr>
+          <w:b/>
+          <w:bCs/>
+        </w:rPr>
+        <w:t xml:space="preserve"> от </w:t>
+      </w:r>
+      <w:proofErr w:type="spellStart"/>
+      <w:r>
+        <w:rPr>
+          <w:b/>
+          <w:bCs/>
+        </w:rPr>
+        <w:t>изолинии</w:t>
+      </w:r>
+      <w:proofErr w:type="spellEnd"/>
+      <w:r>
+        <w:t>;</w:t>
+      </w:r>
+    </w:p>
+    <w:p>
+      <w:pPr>
+        <w:numPr>
+          <w:ilvl w:val="1"/>
+          <w:numId w:val="15"/>
+        </w:numPr>
+      </w:pPr>
+      <w:r>
+        <w:t xml:space="preserve">либо найти </w:t>
+      </w:r>
+      <w:r>
+        <w:rPr>
+          <w:b/>
+          <w:bCs/>
+        </w:rPr>
+        <w:t xml:space="preserve">точку </w:t>
+      </w:r>
+      <w:proofErr w:type="spellStart"/>
+      <w:r>
+        <w:rPr>
+          <w:b/>
+          <w:bCs/>
+        </w:rPr>
+        <w:t>изгиба</w:t>
+      </w:r>
+      <w:proofErr w:type="spellEnd"/>
+      <w:r>
+        <w:t xml:space="preserve">, </w:t>
+      </w:r>
+      <w:proofErr w:type="spellStart"/>
+      <w:r>
+        <w:t>где</w:t>
+      </w:r>
+      <w:proofErr w:type="spellEnd"/>
+      <w:r>
+        <w:t xml:space="preserve"> </w:t>
+      </w:r>
+      <w:proofErr w:type="spellStart"/>
+      <w:r>
+        <w:t>вторая</w:t>
+      </w:r>
+      <w:proofErr w:type="spellEnd"/>
+      <w:r>
+        <w:t xml:space="preserve"> </w:t>
+      </w:r>
+      <w:proofErr w:type="spellStart"/>
+      <w:r>
+        <w:t>производная</w:t>
+      </w:r>
+      <w:proofErr w:type="spellEnd"/>
+      <w:r>
+        <w:t xml:space="preserve"> </w:t>
+      </w:r>
+      <w:proofErr w:type="spellStart"/>
+      <w:r>
+        <w:t>сигнала</w:t>
+      </w:r>
+      <w:proofErr w:type="spellEnd"/>
+      <w:r>
+        <w:t xml:space="preserve"> ≠ 0.</w:t>
+      </w:r>
+    </w:p>
+    <w:p>
+      <w:pPr>
+        <w:ind w:left="360"/>
+      </w:pPr>
+      <w:r>
+        <w:pict w14:anchorId="08C19176">
+          <v:rect id="_x0000_i1080" style="width:0;height:1.5pt" o:hralign="center" o:hrstd="t" o:hr="t" fillcolor="#a0a0a0" stroked="f"/>
+        </w:pict>
+      </w:r>
+    </w:p>
+    <w:p>
+      <w:pPr>
+        <w:ind w:left="360"/>
+        <w:rPr>
+          <w:b/>
+          <w:bCs/>
+        </w:rPr>
+      </w:pPr>
+      <w:r>
+        <w:rPr>
+          <w:rFonts w:ascii="Segoe UI Emoji" w:hAnsi="Segoe UI Emoji" w:cs="Segoe UI Emoji"/>
+          <w:b/>
+          <w:bCs/>
+        </w:rPr>
+        <w:lastRenderedPageBreak/>
+        <w:t>💬</w:t>
+      </w:r>
+      <w:r>
+        <w:rPr>
+          <w:b/>
+          <w:bCs/>
+        </w:rPr>
+        <w:t xml:space="preserve"> </w:t>
+      </w:r>
+      <w:proofErr w:type="spellStart"/>
+      <w:r>
+        <w:rPr>
+          <w:b/>
+          <w:bCs/>
+        </w:rPr>
+        <w:t>Вывод</w:t>
+      </w:r>
+      <w:proofErr w:type="spellEnd"/>
+      <w:r>
+        <w:rPr>
+          <w:b/>
+          <w:bCs/>
+        </w:rPr>
+        <w:t>:</w:t>
+      </w:r>
+    </w:p>
+    <w:p>
+      <w:pPr>
+        <w:ind w:left="360"/>
+      </w:pPr>
+      <w:proofErr w:type="spellStart"/>
+      <w:r>
+        <w:rPr>
+          <w:b/>
+          <w:bCs/>
+        </w:rPr>
+        <w:t>Зубец</w:t>
+      </w:r>
+      <w:proofErr w:type="spellEnd"/>
+      <w:r>
+        <w:rPr>
+          <w:b/>
+          <w:bCs/>
+        </w:rPr>
+        <w:t xml:space="preserve"> P </w:t>
+      </w:r>
+      <w:proofErr w:type="spellStart"/>
+      <w:r>
+        <w:rPr>
+          <w:b/>
+          <w:bCs/>
+        </w:rPr>
+        <w:t>начинается</w:t>
+      </w:r>
+      <w:proofErr w:type="spellEnd"/>
+      <w:r>
+        <w:rPr>
+          <w:b/>
+          <w:bCs/>
+        </w:rPr>
+        <w:t xml:space="preserve"> от </w:t>
+      </w:r>
+      <w:proofErr w:type="spellStart"/>
+      <w:r>
+        <w:rPr>
+          <w:b/>
+          <w:bCs/>
+        </w:rPr>
+        <w:t>момента</w:t>
+      </w:r>
+      <w:proofErr w:type="spellEnd"/>
+      <w:r>
+        <w:rPr>
+          <w:b/>
+          <w:bCs/>
+        </w:rPr>
+        <w:t xml:space="preserve">, </w:t>
+      </w:r>
+      <w:proofErr w:type="spellStart"/>
+      <w:r>
+        <w:rPr>
+          <w:b/>
+          <w:bCs/>
+        </w:rPr>
+        <w:t>где</w:t>
+      </w:r>
+      <w:proofErr w:type="spellEnd"/>
+      <w:r>
+        <w:rPr>
+          <w:b/>
+          <w:bCs/>
+        </w:rPr>
+        <w:t xml:space="preserve"> сигнал </w:t>
+      </w:r>
+      <w:proofErr w:type="spellStart"/>
+      <w:r>
+        <w:rPr>
+          <w:b/>
+          <w:bCs/>
+        </w:rPr>
+        <w:t>начинает</w:t>
+      </w:r>
+      <w:proofErr w:type="spellEnd"/>
+      <w:r>
+        <w:rPr>
+          <w:b/>
+          <w:bCs/>
+        </w:rPr>
+        <w:t xml:space="preserve"> "</w:t>
+      </w:r>
+      <w:proofErr w:type="spellStart"/>
+      <w:r>
+        <w:rPr>
+          <w:b/>
+          <w:bCs/>
+        </w:rPr>
+        <w:t>отклоняться</w:t>
+      </w:r>
+      <w:proofErr w:type="spellEnd"/>
+      <w:r>
+        <w:rPr>
+          <w:b/>
+          <w:bCs/>
+        </w:rPr>
+        <w:t xml:space="preserve">" от </w:t>
+      </w:r>
+      <w:proofErr w:type="spellStart"/>
+      <w:r>
+        <w:rPr>
+          <w:b/>
+          <w:bCs/>
+        </w:rPr>
+        <w:t>изолинии</w:t>
+      </w:r>
+      <w:proofErr w:type="spellEnd"/>
+      <w:r>
+        <w:rPr>
+          <w:b/>
+          <w:bCs/>
+        </w:rPr>
+        <w:t xml:space="preserve"> — </w:t>
+      </w:r>
+      <w:proofErr w:type="spellStart"/>
+      <w:r>
+        <w:rPr>
+          <w:b/>
+          <w:bCs/>
+        </w:rPr>
+        <w:t>вне</w:t>
+      </w:r>
+      <w:proofErr w:type="spellEnd"/>
+      <w:r>
+        <w:rPr>
+          <w:b/>
+          <w:bCs/>
+        </w:rPr>
+        <w:t xml:space="preserve"> </w:t>
+      </w:r>
+      <w:proofErr w:type="spellStart"/>
+      <w:r>
+        <w:rPr>
+          <w:b/>
+          <w:bCs/>
+        </w:rPr>
+        <w:t>зависимости</w:t>
+      </w:r>
+      <w:proofErr w:type="spellEnd"/>
+      <w:r>
+        <w:rPr>
+          <w:b/>
+          <w:bCs/>
+        </w:rPr>
+        <w:t xml:space="preserve"> от </w:t>
+      </w:r>
+      <w:proofErr w:type="spellStart"/>
+      <w:r>
+        <w:rPr>
+          <w:b/>
+          <w:bCs/>
+        </w:rPr>
+        <w:t>направления</w:t>
+      </w:r>
+      <w:proofErr w:type="spellEnd"/>
+      <w:r>
+        <w:rPr>
+          <w:b/>
+          <w:bCs/>
+        </w:rPr>
+        <w:t xml:space="preserve"> (вверх </w:t>
+      </w:r>
+      <w:proofErr w:type="spellStart"/>
+      <w:r>
+        <w:rPr>
+          <w:b/>
+          <w:bCs/>
+        </w:rPr>
+        <w:t>или</w:t>
+      </w:r>
+      <w:proofErr w:type="spellEnd"/>
+      <w:r>
+        <w:rPr>
+          <w:b/>
+          <w:bCs/>
+        </w:rPr>
+        <w:t xml:space="preserve"> вниз). </w:t>
+      </w:r>
+      <w:proofErr w:type="spellStart"/>
+      <w:r>
+        <w:rPr>
+          <w:b/>
+          <w:bCs/>
+        </w:rPr>
+        <w:t>Главное</w:t>
+      </w:r>
+      <w:proofErr w:type="spellEnd"/>
+      <w:r>
+        <w:rPr>
+          <w:b/>
+          <w:bCs/>
+        </w:rPr>
+        <w:t xml:space="preserve"> — </w:t>
+      </w:r>
+      <w:proofErr w:type="spellStart"/>
+      <w:r>
+        <w:rPr>
+          <w:b/>
+          <w:bCs/>
+        </w:rPr>
+        <w:t>это</w:t>
+      </w:r>
+      <w:proofErr w:type="spellEnd"/>
+      <w:r>
+        <w:rPr>
+          <w:b/>
+          <w:bCs/>
+        </w:rPr>
+        <w:t xml:space="preserve"> </w:t>
+      </w:r>
+      <w:proofErr w:type="spellStart"/>
+      <w:r>
+        <w:rPr>
+          <w:b/>
+          <w:bCs/>
+        </w:rPr>
+        <w:t>устойчивое</w:t>
+      </w:r>
+      <w:proofErr w:type="spellEnd"/>
+      <w:r>
+        <w:rPr>
+          <w:b/>
+          <w:bCs/>
+        </w:rPr>
+        <w:t xml:space="preserve">, не </w:t>
+      </w:r>
+      <w:proofErr w:type="spellStart"/>
+      <w:r>
+        <w:rPr>
+          <w:b/>
+          <w:bCs/>
+        </w:rPr>
+        <w:t>шумовое</w:t>
+      </w:r>
+      <w:proofErr w:type="spellEnd"/>
+      <w:r>
+        <w:rPr>
+          <w:b/>
+          <w:bCs/>
+        </w:rPr>
+        <w:t xml:space="preserve">, </w:t>
+      </w:r>
+      <w:proofErr w:type="spellStart"/>
+      <w:r>
+        <w:rPr>
+          <w:b/>
+          <w:bCs/>
+        </w:rPr>
+        <w:t>отклонение</w:t>
+      </w:r>
+      <w:proofErr w:type="spellEnd"/>
+      <w:r>
+        <w:rPr>
+          <w:b/>
+          <w:bCs/>
+        </w:rPr>
+        <w:t>.</w:t>
+      </w:r>
+    </w:p>
+    <w:p>
+      <w:pPr>
+        <w:ind w:left="360"/>
+      </w:pPr>
+      <w:r>
+        <w:pict w14:anchorId="04F612A5">
+          <v:rect id="_x0000_i1081" style="width:0;height:1.5pt" o:hralign="center" o:hrstd="t" o:hr="t" fillcolor="#a0a0a0" stroked="f"/>
+        </w:pict>
+      </w:r>
+    </w:p>
+    <w:p>
+      <w:pPr>
+        <w:ind w:left="360"/>
+      </w:pPr>
+      <w:proofErr w:type="spellStart"/>
+      <w:r>
+        <w:t>Хочешь</w:t>
+      </w:r>
+      <w:proofErr w:type="spellEnd"/>
+      <w:r>
+        <w:t xml:space="preserve">, я </w:t>
+      </w:r>
+      <w:proofErr w:type="spellStart"/>
+      <w:r>
+        <w:t>помогу</w:t>
+      </w:r>
+      <w:proofErr w:type="spellEnd"/>
+      <w:r>
+        <w:t xml:space="preserve"> тебе </w:t>
+      </w:r>
+      <w:proofErr w:type="spellStart"/>
+      <w:r>
+        <w:t>построить</w:t>
+      </w:r>
+      <w:proofErr w:type="spellEnd"/>
+      <w:r>
+        <w:t xml:space="preserve"> алгоритм, </w:t>
+      </w:r>
+      <w:proofErr w:type="spellStart"/>
+      <w:r>
+        <w:t>который</w:t>
+      </w:r>
+      <w:proofErr w:type="spellEnd"/>
+      <w:r>
+        <w:t xml:space="preserve"> </w:t>
+      </w:r>
+      <w:proofErr w:type="spellStart"/>
+      <w:r>
+        <w:t>находит</w:t>
+      </w:r>
+      <w:proofErr w:type="spellEnd"/>
+      <w:r>
+        <w:t xml:space="preserve"> </w:t>
+      </w:r>
+      <w:r>
+        <w:rPr>
+          <w:b/>
+          <w:bCs/>
+        </w:rPr>
+        <w:t xml:space="preserve">точку </w:t>
+      </w:r>
+      <w:proofErr w:type="spellStart"/>
+      <w:r>
+        <w:rPr>
+          <w:b/>
+          <w:bCs/>
+        </w:rPr>
+        <w:t>изгиба</w:t>
+      </w:r>
+      <w:proofErr w:type="spellEnd"/>
+      <w:r>
+        <w:rPr>
+          <w:b/>
+          <w:bCs/>
+        </w:rPr>
+        <w:t xml:space="preserve"> </w:t>
+      </w:r>
+      <w:proofErr w:type="spellStart"/>
+      <w:r>
+        <w:rPr>
+          <w:b/>
+          <w:bCs/>
+        </w:rPr>
+        <w:t>или</w:t>
+      </w:r>
+      <w:proofErr w:type="spellEnd"/>
+      <w:r>
+        <w:rPr>
+          <w:b/>
+          <w:bCs/>
+        </w:rPr>
+        <w:t xml:space="preserve"> </w:t>
+      </w:r>
+      <w:proofErr w:type="spellStart"/>
+      <w:r>
+        <w:rPr>
+          <w:b/>
+          <w:bCs/>
+        </w:rPr>
+        <w:t>устойчивого</w:t>
+      </w:r>
+      <w:proofErr w:type="spellEnd"/>
+      <w:r>
+        <w:rPr>
+          <w:b/>
+          <w:bCs/>
+        </w:rPr>
+        <w:t xml:space="preserve"> </w:t>
+      </w:r>
+      <w:proofErr w:type="spellStart"/>
+      <w:r>
+        <w:rPr>
+          <w:b/>
+          <w:bCs/>
+        </w:rPr>
+        <w:t>отклонения</w:t>
+      </w:r>
+      <w:proofErr w:type="spellEnd"/>
+      <w:r>
+        <w:rPr>
+          <w:b/>
+          <w:bCs/>
+        </w:rPr>
+        <w:t xml:space="preserve"> от </w:t>
+      </w:r>
+      <w:proofErr w:type="spellStart"/>
+      <w:r>
+        <w:rPr>
+          <w:b/>
+          <w:bCs/>
+        </w:rPr>
+        <w:t>изолинии</w:t>
+      </w:r>
+      <w:proofErr w:type="spellEnd"/>
+      <w:r>
+        <w:t xml:space="preserve"> для точного </w:t>
+      </w:r>
+      <w:proofErr w:type="spellStart"/>
+      <w:r>
+        <w:t>определения</w:t>
+      </w:r>
+      <w:proofErr w:type="spellEnd"/>
+      <w:r>
+        <w:t xml:space="preserve"> начала </w:t>
+      </w:r>
+      <w:proofErr w:type="spellStart"/>
+      <w:r>
+        <w:t>зубца</w:t>
+      </w:r>
+      <w:proofErr w:type="spellEnd"/>
+      <w:r>
+        <w:t xml:space="preserve"> P?</w:t>
+      </w:r>
+    </w:p>
+    <w:p>
+      <w:pPr>
+        <w:ind w:left="360"/>
+      </w:pPr>
+    </w:p>
     <w:sectPr>
       <w:pgSz w:w="11906" w:h="16838"/>
       <w:pgMar w:top="850" w:right="850" w:bottom="850" w:left="1417" w:header="708" w:footer="708" w:gutter="0"/>
@@ -19205,6 +22605,155 @@
     </w:lvl>
   </w:abstractNum>
   <w:abstractNum w:abstractNumId="2" w15:restartNumberingAfterBreak="0">
+    <w:nsid w:val="282A20AA"/>
+    <w:multiLevelType w:val="multilevel"/>
+    <w:tmpl w:val="84F40308"/>
+    <w:lvl w:ilvl="0">
+      <w:start w:val="1"/>
+      <w:numFmt w:val="bullet"/>
+      <w:lvlText w:val=""/>
+      <w:lvlJc w:val="left"/>
+      <w:pPr>
+        <w:tabs>
+          <w:tab w:val="num" w:pos="720"/>
+        </w:tabs>
+        <w:ind w:left="720" w:hanging="360"/>
+      </w:pPr>
+      <w:rPr>
+        <w:rFonts w:ascii="Symbol" w:hAnsi="Symbol" w:hint="default"/>
+        <w:sz w:val="20"/>
+      </w:rPr>
+    </w:lvl>
+    <w:lvl w:ilvl="1" w:tentative="1">
+      <w:start w:val="1"/>
+      <w:numFmt w:val="bullet"/>
+      <w:lvlText w:val="o"/>
+      <w:lvlJc w:val="left"/>
+      <w:pPr>
+        <w:tabs>
+          <w:tab w:val="num" w:pos="1440"/>
+        </w:tabs>
+        <w:ind w:left="1440" w:hanging="360"/>
+      </w:pPr>
+      <w:rPr>
+        <w:rFonts w:ascii="Courier New" w:hAnsi="Courier New" w:hint="default"/>
+        <w:sz w:val="20"/>
+      </w:rPr>
+    </w:lvl>
+    <w:lvl w:ilvl="2" w:tentative="1">
+      <w:start w:val="1"/>
+      <w:numFmt w:val="bullet"/>
+      <w:lvlText w:val=""/>
+      <w:lvlJc w:val="left"/>
+      <w:pPr>
+        <w:tabs>
+          <w:tab w:val="num" w:pos="2160"/>
+        </w:tabs>
+        <w:ind w:left="2160" w:hanging="360"/>
+      </w:pPr>
+      <w:rPr>
+        <w:rFonts w:ascii="Wingdings" w:hAnsi="Wingdings" w:hint="default"/>
+        <w:sz w:val="20"/>
+      </w:rPr>
+    </w:lvl>
+    <w:lvl w:ilvl="3" w:tentative="1">
+      <w:start w:val="1"/>
+      <w:numFmt w:val="bullet"/>
+      <w:lvlText w:val=""/>
+      <w:lvlJc w:val="left"/>
+      <w:pPr>
+        <w:tabs>
+          <w:tab w:val="num" w:pos="2880"/>
+        </w:tabs>
+        <w:ind w:left="2880" w:hanging="360"/>
+      </w:pPr>
+      <w:rPr>
+        <w:rFonts w:ascii="Wingdings" w:hAnsi="Wingdings" w:hint="default"/>
+        <w:sz w:val="20"/>
+      </w:rPr>
+    </w:lvl>
+    <w:lvl w:ilvl="4" w:tentative="1">
+      <w:start w:val="1"/>
+      <w:numFmt w:val="bullet"/>
+      <w:lvlText w:val=""/>
+      <w:lvlJc w:val="left"/>
+      <w:pPr>
+        <w:tabs>
+          <w:tab w:val="num" w:pos="3600"/>
+        </w:tabs>
+        <w:ind w:left="3600" w:hanging="360"/>
+      </w:pPr>
+      <w:rPr>
+        <w:rFonts w:ascii="Wingdings" w:hAnsi="Wingdings" w:hint="default"/>
+        <w:sz w:val="20"/>
+      </w:rPr>
+    </w:lvl>
+    <w:lvl w:ilvl="5" w:tentative="1">
+      <w:start w:val="1"/>
+      <w:numFmt w:val="bullet"/>
+      <w:lvlText w:val=""/>
+      <w:lvlJc w:val="left"/>
+      <w:pPr>
+        <w:tabs>
+          <w:tab w:val="num" w:pos="4320"/>
+        </w:tabs>
+        <w:ind w:left="4320" w:hanging="360"/>
+      </w:pPr>
+      <w:rPr>
+        <w:rFonts w:ascii="Wingdings" w:hAnsi="Wingdings" w:hint="default"/>
+        <w:sz w:val="20"/>
+      </w:rPr>
+    </w:lvl>
+    <w:lvl w:ilvl="6" w:tentative="1">
+      <w:start w:val="1"/>
+      <w:numFmt w:val="bullet"/>
+      <w:lvlText w:val=""/>
+      <w:lvlJc w:val="left"/>
+      <w:pPr>
+        <w:tabs>
+          <w:tab w:val="num" w:pos="5040"/>
+        </w:tabs>
+        <w:ind w:left="5040" w:hanging="360"/>
+      </w:pPr>
+      <w:rPr>
+        <w:rFonts w:ascii="Wingdings" w:hAnsi="Wingdings" w:hint="default"/>
+        <w:sz w:val="20"/>
+      </w:rPr>
+    </w:lvl>
+    <w:lvl w:ilvl="7" w:tentative="1">
+      <w:start w:val="1"/>
+      <w:numFmt w:val="bullet"/>
+      <w:lvlText w:val=""/>
+      <w:lvlJc w:val="left"/>
+      <w:pPr>
+        <w:tabs>
+          <w:tab w:val="num" w:pos="5760"/>
+        </w:tabs>
+        <w:ind w:left="5760" w:hanging="360"/>
+      </w:pPr>
+      <w:rPr>
+        <w:rFonts w:ascii="Wingdings" w:hAnsi="Wingdings" w:hint="default"/>
+        <w:sz w:val="20"/>
+      </w:rPr>
+    </w:lvl>
+    <w:lvl w:ilvl="8" w:tentative="1">
+      <w:start w:val="1"/>
+      <w:numFmt w:val="bullet"/>
+      <w:lvlText w:val=""/>
+      <w:lvlJc w:val="left"/>
+      <w:pPr>
+        <w:tabs>
+          <w:tab w:val="num" w:pos="6480"/>
+        </w:tabs>
+        <w:ind w:left="6480" w:hanging="360"/>
+      </w:pPr>
+      <w:rPr>
+        <w:rFonts w:ascii="Wingdings" w:hAnsi="Wingdings" w:hint="default"/>
+        <w:sz w:val="20"/>
+      </w:rPr>
+    </w:lvl>
+  </w:abstractNum>
+  <w:abstractNum w:abstractNumId="3" w15:restartNumberingAfterBreak="0">
     <w:nsid w:val="2A943504"/>
     <w:multiLevelType w:val="multilevel"/>
     <w:tmpl w:val="4ADAF57E"/>
@@ -19353,10 +22902,10 @@
       </w:rPr>
     </w:lvl>
   </w:abstractNum>
-  <w:abstractNum w:abstractNumId="3" w15:restartNumberingAfterBreak="0">
-    <w:nsid w:val="3CA25334"/>
+  <w:abstractNum w:abstractNumId="4" w15:restartNumberingAfterBreak="0">
+    <w:nsid w:val="3B462032"/>
     <w:multiLevelType w:val="multilevel"/>
-    <w:tmpl w:val="81E4B086"/>
+    <w:tmpl w:val="882A495E"/>
     <w:lvl w:ilvl="0">
       <w:start w:val="1"/>
       <w:numFmt w:val="bullet"/>
@@ -19502,10 +23051,10 @@
       </w:rPr>
     </w:lvl>
   </w:abstractNum>
-  <w:abstractNum w:abstractNumId="4" w15:restartNumberingAfterBreak="0">
-    <w:nsid w:val="57D5468B"/>
+  <w:abstractNum w:abstractNumId="5" w15:restartNumberingAfterBreak="0">
+    <w:nsid w:val="3CA25334"/>
     <w:multiLevelType w:val="multilevel"/>
-    <w:tmpl w:val="031A70CC"/>
+    <w:tmpl w:val="81E4B086"/>
     <w:lvl w:ilvl="0">
       <w:start w:val="1"/>
       <w:numFmt w:val="bullet"/>
@@ -19651,10 +23200,240 @@
       </w:rPr>
     </w:lvl>
   </w:abstractNum>
-  <w:abstractNum w:abstractNumId="5" w15:restartNumberingAfterBreak="0">
-    <w:nsid w:val="5A332F54"/>
+  <w:abstractNum w:abstractNumId="6" w15:restartNumberingAfterBreak="0">
+    <w:nsid w:val="42FE528D"/>
     <w:multiLevelType w:val="multilevel"/>
-    <w:tmpl w:val="CDC23758"/>
+    <w:tmpl w:val="7F623ED8"/>
+    <w:lvl w:ilvl="0">
+      <w:start w:val="1"/>
+      <w:numFmt w:val="decimal"/>
+      <w:lvlText w:val="%1."/>
+      <w:lvlJc w:val="left"/>
+      <w:pPr>
+        <w:tabs>
+          <w:tab w:val="num" w:pos="720"/>
+        </w:tabs>
+        <w:ind w:left="720" w:hanging="360"/>
+      </w:pPr>
+    </w:lvl>
+    <w:lvl w:ilvl="1">
+      <w:start w:val="1"/>
+      <w:numFmt w:val="bullet"/>
+      <w:lvlText w:val="o"/>
+      <w:lvlJc w:val="left"/>
+      <w:pPr>
+        <w:tabs>
+          <w:tab w:val="num" w:pos="1440"/>
+        </w:tabs>
+        <w:ind w:left="1440" w:hanging="360"/>
+      </w:pPr>
+      <w:rPr>
+        <w:rFonts w:ascii="Courier New" w:hAnsi="Courier New" w:hint="default"/>
+        <w:sz w:val="20"/>
+      </w:rPr>
+    </w:lvl>
+    <w:lvl w:ilvl="2" w:tentative="1">
+      <w:start w:val="1"/>
+      <w:numFmt w:val="decimal"/>
+      <w:lvlText w:val="%3."/>
+      <w:lvlJc w:val="left"/>
+      <w:pPr>
+        <w:tabs>
+          <w:tab w:val="num" w:pos="2160"/>
+        </w:tabs>
+        <w:ind w:left="2160" w:hanging="360"/>
+      </w:pPr>
+    </w:lvl>
+    <w:lvl w:ilvl="3" w:tentative="1">
+      <w:start w:val="1"/>
+      <w:numFmt w:val="decimal"/>
+      <w:lvlText w:val="%4."/>
+      <w:lvlJc w:val="left"/>
+      <w:pPr>
+        <w:tabs>
+          <w:tab w:val="num" w:pos="2880"/>
+        </w:tabs>
+        <w:ind w:left="2880" w:hanging="360"/>
+      </w:pPr>
+    </w:lvl>
+    <w:lvl w:ilvl="4" w:tentative="1">
+      <w:start w:val="1"/>
+      <w:numFmt w:val="decimal"/>
+      <w:lvlText w:val="%5."/>
+      <w:lvlJc w:val="left"/>
+      <w:pPr>
+        <w:tabs>
+          <w:tab w:val="num" w:pos="3600"/>
+        </w:tabs>
+        <w:ind w:left="3600" w:hanging="360"/>
+      </w:pPr>
+    </w:lvl>
+    <w:lvl w:ilvl="5" w:tentative="1">
+      <w:start w:val="1"/>
+      <w:numFmt w:val="decimal"/>
+      <w:lvlText w:val="%6."/>
+      <w:lvlJc w:val="left"/>
+      <w:pPr>
+        <w:tabs>
+          <w:tab w:val="num" w:pos="4320"/>
+        </w:tabs>
+        <w:ind w:left="4320" w:hanging="360"/>
+      </w:pPr>
+    </w:lvl>
+    <w:lvl w:ilvl="6" w:tentative="1">
+      <w:start w:val="1"/>
+      <w:numFmt w:val="decimal"/>
+      <w:lvlText w:val="%7."/>
+      <w:lvlJc w:val="left"/>
+      <w:pPr>
+        <w:tabs>
+          <w:tab w:val="num" w:pos="5040"/>
+        </w:tabs>
+        <w:ind w:left="5040" w:hanging="360"/>
+      </w:pPr>
+    </w:lvl>
+    <w:lvl w:ilvl="7" w:tentative="1">
+      <w:start w:val="1"/>
+      <w:numFmt w:val="decimal"/>
+      <w:lvlText w:val="%8."/>
+      <w:lvlJc w:val="left"/>
+      <w:pPr>
+        <w:tabs>
+          <w:tab w:val="num" w:pos="5760"/>
+        </w:tabs>
+        <w:ind w:left="5760" w:hanging="360"/>
+      </w:pPr>
+    </w:lvl>
+    <w:lvl w:ilvl="8" w:tentative="1">
+      <w:start w:val="1"/>
+      <w:numFmt w:val="decimal"/>
+      <w:lvlText w:val="%9."/>
+      <w:lvlJc w:val="left"/>
+      <w:pPr>
+        <w:tabs>
+          <w:tab w:val="num" w:pos="6480"/>
+        </w:tabs>
+        <w:ind w:left="6480" w:hanging="360"/>
+      </w:pPr>
+    </w:lvl>
+  </w:abstractNum>
+  <w:abstractNum w:abstractNumId="7" w15:restartNumberingAfterBreak="0">
+    <w:nsid w:val="561F271E"/>
+    <w:multiLevelType w:val="multilevel"/>
+    <w:tmpl w:val="CC92AF1A"/>
+    <w:lvl w:ilvl="0">
+      <w:start w:val="1"/>
+      <w:numFmt w:val="decimal"/>
+      <w:lvlText w:val="%1."/>
+      <w:lvlJc w:val="left"/>
+      <w:pPr>
+        <w:tabs>
+          <w:tab w:val="num" w:pos="720"/>
+        </w:tabs>
+        <w:ind w:left="720" w:hanging="360"/>
+      </w:pPr>
+    </w:lvl>
+    <w:lvl w:ilvl="1" w:tentative="1">
+      <w:start w:val="1"/>
+      <w:numFmt w:val="decimal"/>
+      <w:lvlText w:val="%2."/>
+      <w:lvlJc w:val="left"/>
+      <w:pPr>
+        <w:tabs>
+          <w:tab w:val="num" w:pos="1440"/>
+        </w:tabs>
+        <w:ind w:left="1440" w:hanging="360"/>
+      </w:pPr>
+    </w:lvl>
+    <w:lvl w:ilvl="2" w:tentative="1">
+      <w:start w:val="1"/>
+      <w:numFmt w:val="decimal"/>
+      <w:lvlText w:val="%3."/>
+      <w:lvlJc w:val="left"/>
+      <w:pPr>
+        <w:tabs>
+          <w:tab w:val="num" w:pos="2160"/>
+        </w:tabs>
+        <w:ind w:left="2160" w:hanging="360"/>
+      </w:pPr>
+    </w:lvl>
+    <w:lvl w:ilvl="3" w:tentative="1">
+      <w:start w:val="1"/>
+      <w:numFmt w:val="decimal"/>
+      <w:lvlText w:val="%4."/>
+      <w:lvlJc w:val="left"/>
+      <w:pPr>
+        <w:tabs>
+          <w:tab w:val="num" w:pos="2880"/>
+        </w:tabs>
+        <w:ind w:left="2880" w:hanging="360"/>
+      </w:pPr>
+    </w:lvl>
+    <w:lvl w:ilvl="4" w:tentative="1">
+      <w:start w:val="1"/>
+      <w:numFmt w:val="decimal"/>
+      <w:lvlText w:val="%5."/>
+      <w:lvlJc w:val="left"/>
+      <w:pPr>
+        <w:tabs>
+          <w:tab w:val="num" w:pos="3600"/>
+        </w:tabs>
+        <w:ind w:left="3600" w:hanging="360"/>
+      </w:pPr>
+    </w:lvl>
+    <w:lvl w:ilvl="5" w:tentative="1">
+      <w:start w:val="1"/>
+      <w:numFmt w:val="decimal"/>
+      <w:lvlText w:val="%6."/>
+      <w:lvlJc w:val="left"/>
+      <w:pPr>
+        <w:tabs>
+          <w:tab w:val="num" w:pos="4320"/>
+        </w:tabs>
+        <w:ind w:left="4320" w:hanging="360"/>
+      </w:pPr>
+    </w:lvl>
+    <w:lvl w:ilvl="6" w:tentative="1">
+      <w:start w:val="1"/>
+      <w:numFmt w:val="decimal"/>
+      <w:lvlText w:val="%7."/>
+      <w:lvlJc w:val="left"/>
+      <w:pPr>
+        <w:tabs>
+          <w:tab w:val="num" w:pos="5040"/>
+        </w:tabs>
+        <w:ind w:left="5040" w:hanging="360"/>
+      </w:pPr>
+    </w:lvl>
+    <w:lvl w:ilvl="7" w:tentative="1">
+      <w:start w:val="1"/>
+      <w:numFmt w:val="decimal"/>
+      <w:lvlText w:val="%8."/>
+      <w:lvlJc w:val="left"/>
+      <w:pPr>
+        <w:tabs>
+          <w:tab w:val="num" w:pos="5760"/>
+        </w:tabs>
+        <w:ind w:left="5760" w:hanging="360"/>
+      </w:pPr>
+    </w:lvl>
+    <w:lvl w:ilvl="8" w:tentative="1">
+      <w:start w:val="1"/>
+      <w:numFmt w:val="decimal"/>
+      <w:lvlText w:val="%9."/>
+      <w:lvlJc w:val="left"/>
+      <w:pPr>
+        <w:tabs>
+          <w:tab w:val="num" w:pos="6480"/>
+        </w:tabs>
+        <w:ind w:left="6480" w:hanging="360"/>
+      </w:pPr>
+    </w:lvl>
+  </w:abstractNum>
+  <w:abstractNum w:abstractNumId="8" w15:restartNumberingAfterBreak="0">
+    <w:nsid w:val="579E1552"/>
+    <w:multiLevelType w:val="multilevel"/>
+    <w:tmpl w:val="3F5AAC4A"/>
     <w:lvl w:ilvl="0">
       <w:start w:val="1"/>
       <w:numFmt w:val="bullet"/>
@@ -19800,10 +23579,10 @@
       </w:rPr>
     </w:lvl>
   </w:abstractNum>
-  <w:abstractNum w:abstractNumId="6" w15:restartNumberingAfterBreak="0">
-    <w:nsid w:val="63DA5C21"/>
+  <w:abstractNum w:abstractNumId="9" w15:restartNumberingAfterBreak="0">
+    <w:nsid w:val="57D5468B"/>
     <w:multiLevelType w:val="multilevel"/>
-    <w:tmpl w:val="31FE498A"/>
+    <w:tmpl w:val="031A70CC"/>
     <w:lvl w:ilvl="0">
       <w:start w:val="1"/>
       <w:numFmt w:val="bullet"/>
@@ -19949,7 +23728,305 @@
       </w:rPr>
     </w:lvl>
   </w:abstractNum>
-  <w:abstractNum w:abstractNumId="7" w15:restartNumberingAfterBreak="0">
+  <w:abstractNum w:abstractNumId="10" w15:restartNumberingAfterBreak="0">
+    <w:nsid w:val="5A332F54"/>
+    <w:multiLevelType w:val="multilevel"/>
+    <w:tmpl w:val="CDC23758"/>
+    <w:lvl w:ilvl="0">
+      <w:start w:val="1"/>
+      <w:numFmt w:val="bullet"/>
+      <w:lvlText w:val=""/>
+      <w:lvlJc w:val="left"/>
+      <w:pPr>
+        <w:tabs>
+          <w:tab w:val="num" w:pos="720"/>
+        </w:tabs>
+        <w:ind w:left="720" w:hanging="360"/>
+      </w:pPr>
+      <w:rPr>
+        <w:rFonts w:ascii="Symbol" w:hAnsi="Symbol" w:hint="default"/>
+        <w:sz w:val="20"/>
+      </w:rPr>
+    </w:lvl>
+    <w:lvl w:ilvl="1" w:tentative="1">
+      <w:start w:val="1"/>
+      <w:numFmt w:val="bullet"/>
+      <w:lvlText w:val="o"/>
+      <w:lvlJc w:val="left"/>
+      <w:pPr>
+        <w:tabs>
+          <w:tab w:val="num" w:pos="1440"/>
+        </w:tabs>
+        <w:ind w:left="1440" w:hanging="360"/>
+      </w:pPr>
+      <w:rPr>
+        <w:rFonts w:ascii="Courier New" w:hAnsi="Courier New" w:hint="default"/>
+        <w:sz w:val="20"/>
+      </w:rPr>
+    </w:lvl>
+    <w:lvl w:ilvl="2" w:tentative="1">
+      <w:start w:val="1"/>
+      <w:numFmt w:val="bullet"/>
+      <w:lvlText w:val=""/>
+      <w:lvlJc w:val="left"/>
+      <w:pPr>
+        <w:tabs>
+          <w:tab w:val="num" w:pos="2160"/>
+        </w:tabs>
+        <w:ind w:left="2160" w:hanging="360"/>
+      </w:pPr>
+      <w:rPr>
+        <w:rFonts w:ascii="Wingdings" w:hAnsi="Wingdings" w:hint="default"/>
+        <w:sz w:val="20"/>
+      </w:rPr>
+    </w:lvl>
+    <w:lvl w:ilvl="3" w:tentative="1">
+      <w:start w:val="1"/>
+      <w:numFmt w:val="bullet"/>
+      <w:lvlText w:val=""/>
+      <w:lvlJc w:val="left"/>
+      <w:pPr>
+        <w:tabs>
+          <w:tab w:val="num" w:pos="2880"/>
+        </w:tabs>
+        <w:ind w:left="2880" w:hanging="360"/>
+      </w:pPr>
+      <w:rPr>
+        <w:rFonts w:ascii="Wingdings" w:hAnsi="Wingdings" w:hint="default"/>
+        <w:sz w:val="20"/>
+      </w:rPr>
+    </w:lvl>
+    <w:lvl w:ilvl="4" w:tentative="1">
+      <w:start w:val="1"/>
+      <w:numFmt w:val="bullet"/>
+      <w:lvlText w:val=""/>
+      <w:lvlJc w:val="left"/>
+      <w:pPr>
+        <w:tabs>
+          <w:tab w:val="num" w:pos="3600"/>
+        </w:tabs>
+        <w:ind w:left="3600" w:hanging="360"/>
+      </w:pPr>
+      <w:rPr>
+        <w:rFonts w:ascii="Wingdings" w:hAnsi="Wingdings" w:hint="default"/>
+        <w:sz w:val="20"/>
+      </w:rPr>
+    </w:lvl>
+    <w:lvl w:ilvl="5" w:tentative="1">
+      <w:start w:val="1"/>
+      <w:numFmt w:val="bullet"/>
+      <w:lvlText w:val=""/>
+      <w:lvlJc w:val="left"/>
+      <w:pPr>
+        <w:tabs>
+          <w:tab w:val="num" w:pos="4320"/>
+        </w:tabs>
+        <w:ind w:left="4320" w:hanging="360"/>
+      </w:pPr>
+      <w:rPr>
+        <w:rFonts w:ascii="Wingdings" w:hAnsi="Wingdings" w:hint="default"/>
+        <w:sz w:val="20"/>
+      </w:rPr>
+    </w:lvl>
+    <w:lvl w:ilvl="6" w:tentative="1">
+      <w:start w:val="1"/>
+      <w:numFmt w:val="bullet"/>
+      <w:lvlText w:val=""/>
+      <w:lvlJc w:val="left"/>
+      <w:pPr>
+        <w:tabs>
+          <w:tab w:val="num" w:pos="5040"/>
+        </w:tabs>
+        <w:ind w:left="5040" w:hanging="360"/>
+      </w:pPr>
+      <w:rPr>
+        <w:rFonts w:ascii="Wingdings" w:hAnsi="Wingdings" w:hint="default"/>
+        <w:sz w:val="20"/>
+      </w:rPr>
+    </w:lvl>
+    <w:lvl w:ilvl="7" w:tentative="1">
+      <w:start w:val="1"/>
+      <w:numFmt w:val="bullet"/>
+      <w:lvlText w:val=""/>
+      <w:lvlJc w:val="left"/>
+      <w:pPr>
+        <w:tabs>
+          <w:tab w:val="num" w:pos="5760"/>
+        </w:tabs>
+        <w:ind w:left="5760" w:hanging="360"/>
+      </w:pPr>
+      <w:rPr>
+        <w:rFonts w:ascii="Wingdings" w:hAnsi="Wingdings" w:hint="default"/>
+        <w:sz w:val="20"/>
+      </w:rPr>
+    </w:lvl>
+    <w:lvl w:ilvl="8" w:tentative="1">
+      <w:start w:val="1"/>
+      <w:numFmt w:val="bullet"/>
+      <w:lvlText w:val=""/>
+      <w:lvlJc w:val="left"/>
+      <w:pPr>
+        <w:tabs>
+          <w:tab w:val="num" w:pos="6480"/>
+        </w:tabs>
+        <w:ind w:left="6480" w:hanging="360"/>
+      </w:pPr>
+      <w:rPr>
+        <w:rFonts w:ascii="Wingdings" w:hAnsi="Wingdings" w:hint="default"/>
+        <w:sz w:val="20"/>
+      </w:rPr>
+    </w:lvl>
+  </w:abstractNum>
+  <w:abstractNum w:abstractNumId="11" w15:restartNumberingAfterBreak="0">
+    <w:nsid w:val="63DA5C21"/>
+    <w:multiLevelType w:val="multilevel"/>
+    <w:tmpl w:val="31FE498A"/>
+    <w:lvl w:ilvl="0">
+      <w:start w:val="1"/>
+      <w:numFmt w:val="bullet"/>
+      <w:lvlText w:val=""/>
+      <w:lvlJc w:val="left"/>
+      <w:pPr>
+        <w:tabs>
+          <w:tab w:val="num" w:pos="720"/>
+        </w:tabs>
+        <w:ind w:left="720" w:hanging="360"/>
+      </w:pPr>
+      <w:rPr>
+        <w:rFonts w:ascii="Symbol" w:hAnsi="Symbol" w:hint="default"/>
+        <w:sz w:val="20"/>
+      </w:rPr>
+    </w:lvl>
+    <w:lvl w:ilvl="1" w:tentative="1">
+      <w:start w:val="1"/>
+      <w:numFmt w:val="bullet"/>
+      <w:lvlText w:val="o"/>
+      <w:lvlJc w:val="left"/>
+      <w:pPr>
+        <w:tabs>
+          <w:tab w:val="num" w:pos="1440"/>
+        </w:tabs>
+        <w:ind w:left="1440" w:hanging="360"/>
+      </w:pPr>
+      <w:rPr>
+        <w:rFonts w:ascii="Courier New" w:hAnsi="Courier New" w:hint="default"/>
+        <w:sz w:val="20"/>
+      </w:rPr>
+    </w:lvl>
+    <w:lvl w:ilvl="2" w:tentative="1">
+      <w:start w:val="1"/>
+      <w:numFmt w:val="bullet"/>
+      <w:lvlText w:val=""/>
+      <w:lvlJc w:val="left"/>
+      <w:pPr>
+        <w:tabs>
+          <w:tab w:val="num" w:pos="2160"/>
+        </w:tabs>
+        <w:ind w:left="2160" w:hanging="360"/>
+      </w:pPr>
+      <w:rPr>
+        <w:rFonts w:ascii="Wingdings" w:hAnsi="Wingdings" w:hint="default"/>
+        <w:sz w:val="20"/>
+      </w:rPr>
+    </w:lvl>
+    <w:lvl w:ilvl="3" w:tentative="1">
+      <w:start w:val="1"/>
+      <w:numFmt w:val="bullet"/>
+      <w:lvlText w:val=""/>
+      <w:lvlJc w:val="left"/>
+      <w:pPr>
+        <w:tabs>
+          <w:tab w:val="num" w:pos="2880"/>
+        </w:tabs>
+        <w:ind w:left="2880" w:hanging="360"/>
+      </w:pPr>
+      <w:rPr>
+        <w:rFonts w:ascii="Wingdings" w:hAnsi="Wingdings" w:hint="default"/>
+        <w:sz w:val="20"/>
+      </w:rPr>
+    </w:lvl>
+    <w:lvl w:ilvl="4" w:tentative="1">
+      <w:start w:val="1"/>
+      <w:numFmt w:val="bullet"/>
+      <w:lvlText w:val=""/>
+      <w:lvlJc w:val="left"/>
+      <w:pPr>
+        <w:tabs>
+          <w:tab w:val="num" w:pos="3600"/>
+        </w:tabs>
+        <w:ind w:left="3600" w:hanging="360"/>
+      </w:pPr>
+      <w:rPr>
+        <w:rFonts w:ascii="Wingdings" w:hAnsi="Wingdings" w:hint="default"/>
+        <w:sz w:val="20"/>
+      </w:rPr>
+    </w:lvl>
+    <w:lvl w:ilvl="5" w:tentative="1">
+      <w:start w:val="1"/>
+      <w:numFmt w:val="bullet"/>
+      <w:lvlText w:val=""/>
+      <w:lvlJc w:val="left"/>
+      <w:pPr>
+        <w:tabs>
+          <w:tab w:val="num" w:pos="4320"/>
+        </w:tabs>
+        <w:ind w:left="4320" w:hanging="360"/>
+      </w:pPr>
+      <w:rPr>
+        <w:rFonts w:ascii="Wingdings" w:hAnsi="Wingdings" w:hint="default"/>
+        <w:sz w:val="20"/>
+      </w:rPr>
+    </w:lvl>
+    <w:lvl w:ilvl="6" w:tentative="1">
+      <w:start w:val="1"/>
+      <w:numFmt w:val="bullet"/>
+      <w:lvlText w:val=""/>
+      <w:lvlJc w:val="left"/>
+      <w:pPr>
+        <w:tabs>
+          <w:tab w:val="num" w:pos="5040"/>
+        </w:tabs>
+        <w:ind w:left="5040" w:hanging="360"/>
+      </w:pPr>
+      <w:rPr>
+        <w:rFonts w:ascii="Wingdings" w:hAnsi="Wingdings" w:hint="default"/>
+        <w:sz w:val="20"/>
+      </w:rPr>
+    </w:lvl>
+    <w:lvl w:ilvl="7" w:tentative="1">
+      <w:start w:val="1"/>
+      <w:numFmt w:val="bullet"/>
+      <w:lvlText w:val=""/>
+      <w:lvlJc w:val="left"/>
+      <w:pPr>
+        <w:tabs>
+          <w:tab w:val="num" w:pos="5760"/>
+        </w:tabs>
+        <w:ind w:left="5760" w:hanging="360"/>
+      </w:pPr>
+      <w:rPr>
+        <w:rFonts w:ascii="Wingdings" w:hAnsi="Wingdings" w:hint="default"/>
+        <w:sz w:val="20"/>
+      </w:rPr>
+    </w:lvl>
+    <w:lvl w:ilvl="8" w:tentative="1">
+      <w:start w:val="1"/>
+      <w:numFmt w:val="bullet"/>
+      <w:lvlText w:val=""/>
+      <w:lvlJc w:val="left"/>
+      <w:pPr>
+        <w:tabs>
+          <w:tab w:val="num" w:pos="6480"/>
+        </w:tabs>
+        <w:ind w:left="6480" w:hanging="360"/>
+      </w:pPr>
+      <w:rPr>
+        <w:rFonts w:ascii="Wingdings" w:hAnsi="Wingdings" w:hint="default"/>
+        <w:sz w:val="20"/>
+      </w:rPr>
+    </w:lvl>
+  </w:abstractNum>
+  <w:abstractNum w:abstractNumId="12" w15:restartNumberingAfterBreak="0">
     <w:nsid w:val="65233FB3"/>
     <w:multiLevelType w:val="multilevel"/>
     <w:tmpl w:val="CE14814A"/>
@@ -20098,7 +24175,7 @@
       </w:rPr>
     </w:lvl>
   </w:abstractNum>
-  <w:abstractNum w:abstractNumId="8" w15:restartNumberingAfterBreak="0">
+  <w:abstractNum w:abstractNumId="13" w15:restartNumberingAfterBreak="0">
     <w:nsid w:val="664A6845"/>
     <w:multiLevelType w:val="hybridMultilevel"/>
     <w:tmpl w:val="B1D4C6D2"/>
@@ -20187,32 +24264,199 @@
       </w:pPr>
     </w:lvl>
   </w:abstractNum>
+  <w:abstractNum w:abstractNumId="14" w15:restartNumberingAfterBreak="0">
+    <w:nsid w:val="6DEB3257"/>
+    <w:multiLevelType w:val="multilevel"/>
+    <w:tmpl w:val="DCD2EFDC"/>
+    <w:lvl w:ilvl="0">
+      <w:start w:val="1"/>
+      <w:numFmt w:val="bullet"/>
+      <w:lvlText w:val=""/>
+      <w:lvlJc w:val="left"/>
+      <w:pPr>
+        <w:tabs>
+          <w:tab w:val="num" w:pos="720"/>
+        </w:tabs>
+        <w:ind w:left="720" w:hanging="360"/>
+      </w:pPr>
+      <w:rPr>
+        <w:rFonts w:ascii="Symbol" w:hAnsi="Symbol" w:hint="default"/>
+        <w:sz w:val="20"/>
+      </w:rPr>
+    </w:lvl>
+    <w:lvl w:ilvl="1" w:tentative="1">
+      <w:start w:val="1"/>
+      <w:numFmt w:val="bullet"/>
+      <w:lvlText w:val="o"/>
+      <w:lvlJc w:val="left"/>
+      <w:pPr>
+        <w:tabs>
+          <w:tab w:val="num" w:pos="1440"/>
+        </w:tabs>
+        <w:ind w:left="1440" w:hanging="360"/>
+      </w:pPr>
+      <w:rPr>
+        <w:rFonts w:ascii="Courier New" w:hAnsi="Courier New" w:hint="default"/>
+        <w:sz w:val="20"/>
+      </w:rPr>
+    </w:lvl>
+    <w:lvl w:ilvl="2" w:tentative="1">
+      <w:start w:val="1"/>
+      <w:numFmt w:val="bullet"/>
+      <w:lvlText w:val=""/>
+      <w:lvlJc w:val="left"/>
+      <w:pPr>
+        <w:tabs>
+          <w:tab w:val="num" w:pos="2160"/>
+        </w:tabs>
+        <w:ind w:left="2160" w:hanging="360"/>
+      </w:pPr>
+      <w:rPr>
+        <w:rFonts w:ascii="Wingdings" w:hAnsi="Wingdings" w:hint="default"/>
+        <w:sz w:val="20"/>
+      </w:rPr>
+    </w:lvl>
+    <w:lvl w:ilvl="3" w:tentative="1">
+      <w:start w:val="1"/>
+      <w:numFmt w:val="bullet"/>
+      <w:lvlText w:val=""/>
+      <w:lvlJc w:val="left"/>
+      <w:pPr>
+        <w:tabs>
+          <w:tab w:val="num" w:pos="2880"/>
+        </w:tabs>
+        <w:ind w:left="2880" w:hanging="360"/>
+      </w:pPr>
+      <w:rPr>
+        <w:rFonts w:ascii="Wingdings" w:hAnsi="Wingdings" w:hint="default"/>
+        <w:sz w:val="20"/>
+      </w:rPr>
+    </w:lvl>
+    <w:lvl w:ilvl="4" w:tentative="1">
+      <w:start w:val="1"/>
+      <w:numFmt w:val="bullet"/>
+      <w:lvlText w:val=""/>
+      <w:lvlJc w:val="left"/>
+      <w:pPr>
+        <w:tabs>
+          <w:tab w:val="num" w:pos="3600"/>
+        </w:tabs>
+        <w:ind w:left="3600" w:hanging="360"/>
+      </w:pPr>
+      <w:rPr>
+        <w:rFonts w:ascii="Wingdings" w:hAnsi="Wingdings" w:hint="default"/>
+        <w:sz w:val="20"/>
+      </w:rPr>
+    </w:lvl>
+    <w:lvl w:ilvl="5" w:tentative="1">
+      <w:start w:val="1"/>
+      <w:numFmt w:val="bullet"/>
+      <w:lvlText w:val=""/>
+      <w:lvlJc w:val="left"/>
+      <w:pPr>
+        <w:tabs>
+          <w:tab w:val="num" w:pos="4320"/>
+        </w:tabs>
+        <w:ind w:left="4320" w:hanging="360"/>
+      </w:pPr>
+      <w:rPr>
+        <w:rFonts w:ascii="Wingdings" w:hAnsi="Wingdings" w:hint="default"/>
+        <w:sz w:val="20"/>
+      </w:rPr>
+    </w:lvl>
+    <w:lvl w:ilvl="6" w:tentative="1">
+      <w:start w:val="1"/>
+      <w:numFmt w:val="bullet"/>
+      <w:lvlText w:val=""/>
+      <w:lvlJc w:val="left"/>
+      <w:pPr>
+        <w:tabs>
+          <w:tab w:val="num" w:pos="5040"/>
+        </w:tabs>
+        <w:ind w:left="5040" w:hanging="360"/>
+      </w:pPr>
+      <w:rPr>
+        <w:rFonts w:ascii="Wingdings" w:hAnsi="Wingdings" w:hint="default"/>
+        <w:sz w:val="20"/>
+      </w:rPr>
+    </w:lvl>
+    <w:lvl w:ilvl="7" w:tentative="1">
+      <w:start w:val="1"/>
+      <w:numFmt w:val="bullet"/>
+      <w:lvlText w:val=""/>
+      <w:lvlJc w:val="left"/>
+      <w:pPr>
+        <w:tabs>
+          <w:tab w:val="num" w:pos="5760"/>
+        </w:tabs>
+        <w:ind w:left="5760" w:hanging="360"/>
+      </w:pPr>
+      <w:rPr>
+        <w:rFonts w:ascii="Wingdings" w:hAnsi="Wingdings" w:hint="default"/>
+        <w:sz w:val="20"/>
+      </w:rPr>
+    </w:lvl>
+    <w:lvl w:ilvl="8" w:tentative="1">
+      <w:start w:val="1"/>
+      <w:numFmt w:val="bullet"/>
+      <w:lvlText w:val=""/>
+      <w:lvlJc w:val="left"/>
+      <w:pPr>
+        <w:tabs>
+          <w:tab w:val="num" w:pos="6480"/>
+        </w:tabs>
+        <w:ind w:left="6480" w:hanging="360"/>
+      </w:pPr>
+      <w:rPr>
+        <w:rFonts w:ascii="Wingdings" w:hAnsi="Wingdings" w:hint="default"/>
+        <w:sz w:val="20"/>
+      </w:rPr>
+    </w:lvl>
+  </w:abstractNum>
   <w:num w:numId="1" w16cid:durableId="1287392488">
-    <w:abstractNumId w:val="3"/>
+    <w:abstractNumId w:val="5"/>
   </w:num>
   <w:num w:numId="2" w16cid:durableId="1101144823">
-    <w:abstractNumId w:val="5"/>
+    <w:abstractNumId w:val="10"/>
   </w:num>
   <w:num w:numId="3" w16cid:durableId="1406293613">
     <w:abstractNumId w:val="0"/>
   </w:num>
   <w:num w:numId="4" w16cid:durableId="1262445275">
-    <w:abstractNumId w:val="7"/>
+    <w:abstractNumId w:val="12"/>
   </w:num>
   <w:num w:numId="5" w16cid:durableId="995764128">
-    <w:abstractNumId w:val="2"/>
+    <w:abstractNumId w:val="3"/>
   </w:num>
   <w:num w:numId="6" w16cid:durableId="1463033085">
-    <w:abstractNumId w:val="6"/>
+    <w:abstractNumId w:val="11"/>
   </w:num>
   <w:num w:numId="7" w16cid:durableId="1548033728">
-    <w:abstractNumId w:val="4"/>
+    <w:abstractNumId w:val="9"/>
   </w:num>
   <w:num w:numId="8" w16cid:durableId="425856020">
     <w:abstractNumId w:val="1"/>
   </w:num>
   <w:num w:numId="9" w16cid:durableId="731342943">
+    <w:abstractNumId w:val="13"/>
+  </w:num>
+  <w:num w:numId="10" w16cid:durableId="2143228945">
+    <w:abstractNumId w:val="7"/>
+  </w:num>
+  <w:num w:numId="11" w16cid:durableId="261693045">
     <w:abstractNumId w:val="8"/>
+  </w:num>
+  <w:num w:numId="12" w16cid:durableId="160703934">
+    <w:abstractNumId w:val="4"/>
+  </w:num>
+  <w:num w:numId="13" w16cid:durableId="1140732963">
+    <w:abstractNumId w:val="2"/>
+  </w:num>
+  <w:num w:numId="14" w16cid:durableId="1021661317">
+    <w:abstractNumId w:val="14"/>
+  </w:num>
+  <w:num w:numId="15" w16cid:durableId="779376771">
+    <w:abstractNumId w:val="6"/>
   </w:num>
 </w:numbering>
 </file>
@@ -20820,7 +25064,6 @@
   <w:style w:type="character" w:default="1" w:styleId="a0">
     <w:name w:val="Default Paragraph Font"/>
     <w:uiPriority w:val="1"/>
-    <w:semiHidden/>
     <w:unhideWhenUsed/>
   </w:style>
   <w:style w:type="table" w:default="1" w:styleId="a1">

</xml_diff>